<commit_message>
updated the documentation and architecture design added
</commit_message>
<xml_diff>
--- a/CapstoneProject4Document.docx
+++ b/CapstoneProject4Document.docx
@@ -90,7 +90,7 @@
     <w:p>
       <w:r>
         <w:pict w14:anchorId="4835756B">
-          <v:rect id="_x0000_i1147" style="width:0;height:1.5pt" o:hralign="center" o:hrstd="t" o:hr="t" fillcolor="#a0a0a0" stroked="f"/>
+          <v:rect id="_x0000_i1025" style="width:0;height:1.5pt" o:hralign="center" o:hrstd="t" o:hr="t" fillcolor="#a0a0a0" stroked="f"/>
         </w:pict>
       </w:r>
     </w:p>
@@ -125,20 +125,15 @@
       </w:r>
     </w:p>
     <w:p>
-      <w:proofErr w:type="spellStart"/>
-      <w:r>
-        <w:t>websockets</w:t>
-      </w:r>
-      <w:proofErr w:type="spellEnd"/>
-      <w:r>
-        <w:t>/   → Real-time communication module</w:t>
+      <w:r>
+        <w:t>websockets/   → Real-time communication module</w:t>
       </w:r>
     </w:p>
     <w:p/>
     <w:p>
       <w:r>
         <w:pict w14:anchorId="45E6637C">
-          <v:rect id="_x0000_i1148" style="width:0;height:1.5pt" o:hralign="center" o:hrstd="t" o:hr="t" fillcolor="#a0a0a0" stroked="f"/>
+          <v:rect id="_x0000_i1026" style="width:0;height:1.5pt" o:hralign="center" o:hrstd="t" o:hr="t" fillcolor="#a0a0a0" stroked="f"/>
         </w:pict>
       </w:r>
     </w:p>
@@ -156,23 +151,7 @@
           <w:b/>
           <w:bCs/>
         </w:rPr>
-        <w:t xml:space="preserve">Sprint 1: Architecture Design, </w:t>
-      </w:r>
-      <w:proofErr w:type="spellStart"/>
-      <w:r>
-        <w:rPr>
-          <w:b/>
-          <w:bCs/>
-        </w:rPr>
-        <w:t>Dockerization</w:t>
-      </w:r>
-      <w:proofErr w:type="spellEnd"/>
-      <w:r>
-        <w:rPr>
-          <w:b/>
-          <w:bCs/>
-        </w:rPr>
-        <w:t>, and Jenkins Setup</w:t>
+        <w:t>Sprint 1: Architecture Design, Dockerization, and Jenkins Setup</w:t>
       </w:r>
     </w:p>
     <w:p>
@@ -197,23 +176,7 @@
     </w:p>
     <w:p>
       <w:r>
-        <w:t xml:space="preserve">  - </w:t>
-      </w:r>
-      <w:proofErr w:type="spellStart"/>
-      <w:r>
-        <w:t>Dockerize</w:t>
-      </w:r>
-      <w:proofErr w:type="spellEnd"/>
-      <w:r>
-        <w:t xml:space="preserve"> the web application by creating a </w:t>
-      </w:r>
-      <w:proofErr w:type="spellStart"/>
-      <w:r>
-        <w:t>Dockerfile</w:t>
-      </w:r>
-      <w:proofErr w:type="spellEnd"/>
-      <w:r>
-        <w:t xml:space="preserve"> and storing the image in AWS ECR.</w:t>
+        <w:t>  - Dockerize the web application by creating a Dockerfile and storing the image in AWS ECR.</w:t>
       </w:r>
     </w:p>
     <w:p>
@@ -233,15 +196,7 @@
     </w:p>
     <w:p>
       <w:r>
-        <w:t xml:space="preserve">- Goal: Complete the application architecture, </w:t>
-      </w:r>
-      <w:proofErr w:type="spellStart"/>
-      <w:r>
-        <w:t>Dockerize</w:t>
-      </w:r>
-      <w:proofErr w:type="spellEnd"/>
-      <w:r>
-        <w:t xml:space="preserve"> the application, and establish a Jenkins server for CI/CD.</w:t>
+        <w:t>- Goal: Complete the application architecture, Dockerize the application, and establish a Jenkins server for CI/CD.</w:t>
       </w:r>
     </w:p>
     <w:p>
@@ -257,7 +212,7 @@
           <w:bCs/>
         </w:rPr>
         <w:pict w14:anchorId="4B7094ED">
-          <v:rect id="_x0000_i1157" style="width:0;height:1.5pt" o:hralign="center" o:hrstd="t" o:hr="t" fillcolor="#a0a0a0" stroked="f"/>
+          <v:rect id="_x0000_i1027" style="width:0;height:1.5pt" o:hralign="center" o:hrstd="t" o:hr="t" fillcolor="#a0a0a0" stroked="f"/>
         </w:pict>
       </w:r>
     </w:p>
@@ -283,13 +238,82 @@
           <w:bCs/>
         </w:rPr>
       </w:pPr>
+    </w:p>
+    <w:p>
+      <w:pPr>
+        <w:rPr>
+          <w:b/>
+          <w:bCs/>
+        </w:rPr>
+      </w:pPr>
+      <w:r>
+        <w:rPr>
+          <w:noProof/>
+        </w:rPr>
+        <w:drawing>
+          <wp:inline distT="0" distB="0" distL="0" distR="0" wp14:anchorId="6845101A" wp14:editId="1577F9B3">
+            <wp:extent cx="5832231" cy="3820676"/>
+            <wp:effectExtent l="0" t="0" r="0" b="8890"/>
+            <wp:docPr id="1739775115" name="Picture 1"/>
+            <wp:cNvGraphicFramePr>
+              <a:graphicFrameLocks xmlns:a="http://schemas.openxmlformats.org/drawingml/2006/main" noChangeAspect="1"/>
+            </wp:cNvGraphicFramePr>
+            <a:graphic xmlns:a="http://schemas.openxmlformats.org/drawingml/2006/main">
+              <a:graphicData uri="http://schemas.openxmlformats.org/drawingml/2006/picture">
+                <pic:pic xmlns:pic="http://schemas.openxmlformats.org/drawingml/2006/picture">
+                  <pic:nvPicPr>
+                    <pic:cNvPr id="0" name="Picture 85"/>
+                    <pic:cNvPicPr>
+                      <a:picLocks noChangeAspect="1" noChangeArrowheads="1"/>
+                    </pic:cNvPicPr>
+                  </pic:nvPicPr>
+                  <pic:blipFill>
+                    <a:blip r:embed="rId5" cstate="print">
+                      <a:extLst>
+                        <a:ext uri="{28A0092B-C50C-407E-A947-70E740481C1C}">
+                          <a14:useLocalDpi xmlns:a14="http://schemas.microsoft.com/office/drawing/2010/main" val="0"/>
+                        </a:ext>
+                      </a:extLst>
+                    </a:blip>
+                    <a:srcRect/>
+                    <a:stretch>
+                      <a:fillRect/>
+                    </a:stretch>
+                  </pic:blipFill>
+                  <pic:spPr bwMode="auto">
+                    <a:xfrm>
+                      <a:off x="0" y="0"/>
+                      <a:ext cx="5846280" cy="3829879"/>
+                    </a:xfrm>
+                    <a:prstGeom prst="rect">
+                      <a:avLst/>
+                    </a:prstGeom>
+                    <a:noFill/>
+                    <a:ln>
+                      <a:noFill/>
+                    </a:ln>
+                  </pic:spPr>
+                </pic:pic>
+              </a:graphicData>
+            </a:graphic>
+          </wp:inline>
+        </w:drawing>
+      </w:r>
+    </w:p>
+    <w:p>
+      <w:pPr>
+        <w:rPr>
+          <w:b/>
+          <w:bCs/>
+        </w:rPr>
+      </w:pPr>
       <w:r>
         <w:rPr>
           <w:b/>
           <w:bCs/>
         </w:rPr>
         <w:pict w14:anchorId="780ABB1A">
-          <v:rect id="_x0000_i1158" style="width:0;height:1.5pt" o:hralign="center" o:hrstd="t" o:hr="t" fillcolor="#a0a0a0" stroked="f"/>
+          <v:rect id="_x0000_i1028" style="width:0;height:1.5pt" o:hralign="center" o:hrstd="t" o:hr="t" fillcolor="#a0a0a0" stroked="f"/>
         </w:pict>
       </w:r>
     </w:p>
@@ -320,6 +344,7 @@
           <w:b/>
           <w:bCs/>
         </w:rPr>
+        <w:lastRenderedPageBreak/>
         <w:t>Backend (Node.js)</w:t>
       </w:r>
     </w:p>
@@ -342,15 +367,7 @@
         </w:numPr>
       </w:pPr>
       <w:r>
-        <w:t xml:space="preserve">Installed dependencies using </w:t>
-      </w:r>
-      <w:proofErr w:type="spellStart"/>
-      <w:r>
-        <w:t>npm</w:t>
-      </w:r>
-      <w:proofErr w:type="spellEnd"/>
-      <w:r>
-        <w:t xml:space="preserve"> install</w:t>
+        <w:t>Installed dependencies using npm install</w:t>
       </w:r>
     </w:p>
     <w:p>
@@ -367,7 +384,7 @@
     <w:p>
       <w:r>
         <w:pict w14:anchorId="5900090C">
-          <v:rect id="_x0000_i1117" style="width:0;height:1.5pt" o:hralign="center" o:hrstd="t" o:hr="t" fillcolor="#a0a0a0" stroked="f"/>
+          <v:rect id="_x0000_i1029" style="width:0;height:1.5pt" o:hralign="center" o:hrstd="t" o:hr="t" fillcolor="#a0a0a0" stroked="f"/>
         </w:pict>
       </w:r>
     </w:p>
@@ -422,7 +439,7 @@
     <w:p>
       <w:r>
         <w:pict w14:anchorId="7167FFBA">
-          <v:rect id="_x0000_i1118" style="width:0;height:1.5pt" o:hralign="center" o:hrstd="t" o:hr="t" fillcolor="#a0a0a0" stroked="f"/>
+          <v:rect id="_x0000_i1030" style="width:0;height:1.5pt" o:hralign="center" o:hrstd="t" o:hr="t" fillcolor="#a0a0a0" stroked="f"/>
         </w:pict>
       </w:r>
     </w:p>
@@ -443,15 +460,7 @@
     </w:p>
     <w:p>
       <w:r>
-        <w:t>A docker-</w:t>
-      </w:r>
-      <w:proofErr w:type="spellStart"/>
-      <w:r>
-        <w:t>compose.yaml</w:t>
-      </w:r>
-      <w:proofErr w:type="spellEnd"/>
-      <w:r>
-        <w:t xml:space="preserve"> file was created to manage multi-container setup.</w:t>
+        <w:t>A docker-compose.yaml file was created to manage multi-container setup.</w:t>
       </w:r>
     </w:p>
     <w:p>
@@ -492,7 +501,6 @@
         </w:numPr>
       </w:pPr>
       <w:r>
-        <w:lastRenderedPageBreak/>
         <w:t>Port: 5050:5000</w:t>
       </w:r>
     </w:p>
@@ -580,7 +588,7 @@
     <w:p>
       <w:r>
         <w:pict w14:anchorId="3DCA88C4">
-          <v:rect id="_x0000_i1119" style="width:0;height:1.5pt" o:hralign="center" o:hrstd="t" o:hr="t" fillcolor="#a0a0a0" stroked="f"/>
+          <v:rect id="_x0000_i1031" style="width:0;height:1.5pt" o:hralign="center" o:hrstd="t" o:hr="t" fillcolor="#a0a0a0" stroked="f"/>
         </w:pict>
       </w:r>
     </w:p>
@@ -621,6 +629,7 @@
     </w:p>
     <w:p>
       <w:r>
+        <w:lastRenderedPageBreak/>
         <w:t>AWS_BUCKET_NAME</w:t>
       </w:r>
     </w:p>
@@ -654,7 +663,7 @@
     <w:p>
       <w:r>
         <w:pict w14:anchorId="1DEDAD55">
-          <v:rect id="_x0000_i1120" style="width:0;height:1.5pt" o:hralign="center" o:hrstd="t" o:hr="t" fillcolor="#a0a0a0" stroked="f"/>
+          <v:rect id="_x0000_i1032" style="width:0;height:1.5pt" o:hralign="center" o:hrstd="t" o:hr="t" fillcolor="#a0a0a0" stroked="f"/>
         </w:pict>
       </w:r>
     </w:p>
@@ -685,11 +694,9 @@
           <w:numId w:val="5"/>
         </w:numPr>
       </w:pPr>
-      <w:proofErr w:type="spellStart"/>
       <w:r>
         <w:t>multer</w:t>
       </w:r>
-      <w:proofErr w:type="spellEnd"/>
     </w:p>
     <w:p>
       <w:pPr>
@@ -725,7 +732,6 @@
           <w:b/>
           <w:bCs/>
         </w:rPr>
-        <w:lastRenderedPageBreak/>
         <w:t>Bucket Details:</w:t>
       </w:r>
     </w:p>
@@ -737,15 +743,7 @@
         </w:numPr>
       </w:pPr>
       <w:r>
-        <w:t xml:space="preserve">Bucket Name: </w:t>
-      </w:r>
-      <w:proofErr w:type="spellStart"/>
-      <w:r>
-        <w:t>tradinggame</w:t>
-      </w:r>
-      <w:proofErr w:type="spellEnd"/>
-      <w:r>
-        <w:t>-capstone</w:t>
+        <w:t>Bucket Name: tradinggame-capstone</w:t>
       </w:r>
     </w:p>
     <w:p>
@@ -820,7 +818,7 @@
     <w:p>
       <w:r>
         <w:pict w14:anchorId="421F5F75">
-          <v:rect id="_x0000_i1121" style="width:0;height:1.5pt" o:hralign="center" o:hrstd="t" o:hr="t" fillcolor="#a0a0a0" stroked="f"/>
+          <v:rect id="_x0000_i1033" style="width:0;height:1.5pt" o:hralign="center" o:hrstd="t" o:hr="t" fillcolor="#a0a0a0" stroked="f"/>
         </w:pict>
       </w:r>
     </w:p>
@@ -878,8 +876,9 @@
     </w:p>
     <w:p>
       <w:r>
+        <w:lastRenderedPageBreak/>
         <w:pict w14:anchorId="489DF394">
-          <v:rect id="_x0000_i1122" style="width:0;height:1.5pt" o:hralign="center" o:hrstd="t" o:hr="t" fillcolor="#a0a0a0" stroked="f"/>
+          <v:rect id="_x0000_i1034" style="width:0;height:1.5pt" o:hralign="center" o:hrstd="t" o:hr="t" fillcolor="#a0a0a0" stroked="f"/>
         </w:pict>
       </w:r>
     </w:p>
@@ -923,7 +922,7 @@
     <w:p>
       <w:r>
         <w:pict w14:anchorId="6E965A11">
-          <v:rect id="_x0000_i1123" style="width:0;height:1.5pt" o:hralign="center" o:hrstd="t" o:hr="t" fillcolor="#a0a0a0" stroked="f"/>
+          <v:rect id="_x0000_i1035" style="width:0;height:1.5pt" o:hralign="center" o:hrstd="t" o:hr="t" fillcolor="#a0a0a0" stroked="f"/>
         </w:pict>
       </w:r>
     </w:p>
@@ -965,30 +964,15 @@
       </w:r>
     </w:p>
     <w:p>
-      <w:proofErr w:type="spellStart"/>
-      <w:r>
-        <w:t>const</w:t>
-      </w:r>
-      <w:proofErr w:type="spellEnd"/>
-      <w:r>
-        <w:t xml:space="preserve"> PORT = </w:t>
-      </w:r>
-      <w:proofErr w:type="spellStart"/>
-      <w:proofErr w:type="gramStart"/>
-      <w:r>
-        <w:t>process.env.PORT</w:t>
-      </w:r>
-      <w:proofErr w:type="spellEnd"/>
-      <w:proofErr w:type="gramEnd"/>
-      <w:r>
-        <w:t xml:space="preserve"> || 5000;</w:t>
+      <w:r>
+        <w:t>const PORT = process.env.PORT || 5000;</w:t>
       </w:r>
     </w:p>
     <w:p/>
     <w:p>
       <w:r>
         <w:pict w14:anchorId="190A2E32">
-          <v:rect id="_x0000_i1124" style="width:0;height:1.5pt" o:hralign="center" o:hrstd="t" o:hr="t" fillcolor="#a0a0a0" stroked="f"/>
+          <v:rect id="_x0000_i1036" style="width:0;height:1.5pt" o:hralign="center" o:hrstd="t" o:hr="t" fillcolor="#a0a0a0" stroked="f"/>
         </w:pict>
       </w:r>
     </w:p>
@@ -1031,9 +1015,8 @@
     </w:p>
     <w:p>
       <w:r>
-        <w:lastRenderedPageBreak/>
         <w:pict w14:anchorId="369AFCEC">
-          <v:rect id="_x0000_i1125" style="width:0;height:1.5pt" o:hralign="center" o:hrstd="t" o:hr="t" fillcolor="#a0a0a0" stroked="f"/>
+          <v:rect id="_x0000_i1037" style="width:0;height:1.5pt" o:hralign="center" o:hrstd="t" o:hr="t" fillcolor="#a0a0a0" stroked="f"/>
         </w:pict>
       </w:r>
     </w:p>
@@ -1091,15 +1074,7 @@
         </w:numPr>
       </w:pPr>
       <w:r>
-        <w:t>Install Backend Dependencies (</w:t>
-      </w:r>
-      <w:proofErr w:type="spellStart"/>
-      <w:r>
-        <w:t>npm</w:t>
-      </w:r>
-      <w:proofErr w:type="spellEnd"/>
-      <w:r>
-        <w:t xml:space="preserve"> install)</w:t>
+        <w:t>Install Backend Dependencies (npm install)</w:t>
       </w:r>
     </w:p>
     <w:p>
@@ -1138,7 +1113,7 @@
     <w:p>
       <w:r>
         <w:pict w14:anchorId="72E5AB85">
-          <v:rect id="_x0000_i1126" style="width:0;height:1.5pt" o:hralign="center" o:hrstd="t" o:hr="t" fillcolor="#a0a0a0" stroked="f"/>
+          <v:rect id="_x0000_i1038" style="width:0;height:1.5pt" o:hralign="center" o:hrstd="t" o:hr="t" fillcolor="#a0a0a0" stroked="f"/>
         </w:pict>
       </w:r>
     </w:p>
@@ -1198,13 +1173,14 @@
         </w:numPr>
       </w:pPr>
       <w:r>
+        <w:lastRenderedPageBreak/>
         <w:t>S3 access permissions</w:t>
       </w:r>
     </w:p>
     <w:p>
       <w:r>
         <w:pict w14:anchorId="6FF1F996">
-          <v:rect id="_x0000_i1127" style="width:0;height:1.5pt" o:hralign="center" o:hrstd="t" o:hr="t" fillcolor="#a0a0a0" stroked="f"/>
+          <v:rect id="_x0000_i1039" style="width:0;height:1.5pt" o:hralign="center" o:hrstd="t" o:hr="t" fillcolor="#a0a0a0" stroked="f"/>
         </w:pict>
       </w:r>
     </w:p>
@@ -1292,7 +1268,7 @@
     <w:p>
       <w:r>
         <w:pict w14:anchorId="3100DB77">
-          <v:rect id="_x0000_i1128" style="width:0;height:1.5pt" o:hralign="center" o:hrstd="t" o:hr="t" fillcolor="#a0a0a0" stroked="f"/>
+          <v:rect id="_x0000_i1040" style="width:0;height:1.5pt" o:hralign="center" o:hrstd="t" o:hr="t" fillcolor="#a0a0a0" stroked="f"/>
         </w:pict>
       </w:r>
     </w:p>
@@ -1352,7 +1328,6 @@
         <w:rPr>
           <w:rFonts w:ascii="Segoe UI Symbol" w:hAnsi="Segoe UI Symbol" w:cs="Segoe UI Symbol"/>
         </w:rPr>
-        <w:lastRenderedPageBreak/>
         <w:t>✔</w:t>
       </w:r>
       <w:r>
@@ -1374,7 +1349,7 @@
     <w:p>
       <w:r>
         <w:pict w14:anchorId="08F03455">
-          <v:rect id="_x0000_i1129" style="width:0;height:1.5pt" o:hralign="center" o:hrstd="t" o:hr="t" fillcolor="#a0a0a0" stroked="f"/>
+          <v:rect id="_x0000_i1041" style="width:0;height:1.5pt" o:hralign="center" o:hrstd="t" o:hr="t" fillcolor="#a0a0a0" stroked="f"/>
         </w:pict>
       </w:r>
     </w:p>
@@ -1440,7 +1415,7 @@
     <w:p>
       <w:r>
         <w:pict w14:anchorId="6FBF2821">
-          <v:rect id="_x0000_i1742" style="width:0;height:1.5pt" o:hralign="center" o:hrstd="t" o:hr="t" fillcolor="#a0a0a0" stroked="f"/>
+          <v:rect id="_x0000_i1042" style="width:0;height:1.5pt" o:hralign="center" o:hrstd="t" o:hr="t" fillcolor="#a0a0a0" stroked="f"/>
         </w:pict>
       </w:r>
     </w:p>
@@ -1478,6 +1453,9 @@
     </w:p>
     <w:p>
       <w:r>
+        <w:rPr>
+          <w:noProof/>
+        </w:rPr>
         <w:drawing>
           <wp:inline distT="0" distB="0" distL="0" distR="0" wp14:anchorId="7F020EDB" wp14:editId="6F830B2F">
             <wp:extent cx="5731510" cy="387985"/>
@@ -1496,7 +1474,7 @@
                     </pic:cNvPicPr>
                   </pic:nvPicPr>
                   <pic:blipFill>
-                    <a:blip r:embed="rId5" cstate="print">
+                    <a:blip r:embed="rId6" cstate="print">
                       <a:extLst>
                         <a:ext uri="{28A0092B-C50C-407E-A947-70E740481C1C}">
                           <a14:useLocalDpi xmlns:a14="http://schemas.microsoft.com/office/drawing/2010/main" val="0"/>
@@ -1536,6 +1514,9 @@
     </w:p>
     <w:p>
       <w:r>
+        <w:rPr>
+          <w:noProof/>
+        </w:rPr>
         <w:drawing>
           <wp:inline distT="0" distB="0" distL="0" distR="0" wp14:anchorId="0D00DE2C" wp14:editId="0E5BB6DE">
             <wp:extent cx="5731510" cy="380365"/>
@@ -1554,7 +1535,7 @@
                     </pic:cNvPicPr>
                   </pic:nvPicPr>
                   <pic:blipFill>
-                    <a:blip r:embed="rId6" cstate="print">
+                    <a:blip r:embed="rId7" cstate="print">
                       <a:extLst>
                         <a:ext uri="{28A0092B-C50C-407E-A947-70E740481C1C}">
                           <a14:useLocalDpi xmlns:a14="http://schemas.microsoft.com/office/drawing/2010/main" val="0"/>
@@ -1594,6 +1575,9 @@
     </w:p>
     <w:p>
       <w:r>
+        <w:rPr>
+          <w:noProof/>
+        </w:rPr>
         <w:drawing>
           <wp:inline distT="0" distB="0" distL="0" distR="0" wp14:anchorId="75580623" wp14:editId="6B53F144">
             <wp:extent cx="5731510" cy="1355090"/>
@@ -1612,7 +1596,7 @@
                     </pic:cNvPicPr>
                   </pic:nvPicPr>
                   <pic:blipFill>
-                    <a:blip r:embed="rId7" cstate="print">
+                    <a:blip r:embed="rId8" cstate="print">
                       <a:extLst>
                         <a:ext uri="{28A0092B-C50C-407E-A947-70E740481C1C}">
                           <a14:useLocalDpi xmlns:a14="http://schemas.microsoft.com/office/drawing/2010/main" val="0"/>
@@ -1646,18 +1630,14 @@
     </w:p>
     <w:p>
       <w:r>
-        <w:lastRenderedPageBreak/>
-        <w:t xml:space="preserve">Frontend </w:t>
-      </w:r>
-      <w:r>
-        <w:t>Running:</w:t>
-      </w:r>
-      <w:r>
-        <w:t xml:space="preserve"> http://localhost:8080/</w:t>
-      </w:r>
-    </w:p>
-    <w:p>
-      <w:r>
+        <w:t>Frontend Running: http://localhost:8080/</w:t>
+      </w:r>
+    </w:p>
+    <w:p>
+      <w:r>
+        <w:rPr>
+          <w:noProof/>
+        </w:rPr>
         <w:drawing>
           <wp:inline distT="0" distB="0" distL="0" distR="0" wp14:anchorId="4CF069D8" wp14:editId="04668048">
             <wp:extent cx="5731510" cy="3432810"/>
@@ -1671,68 +1651,6 @@
                 <pic:pic xmlns:pic="http://schemas.openxmlformats.org/drawingml/2006/picture">
                   <pic:nvPicPr>
                     <pic:cNvPr id="0" name="Picture 173"/>
-                    <pic:cNvPicPr>
-                      <a:picLocks noChangeAspect="1" noChangeArrowheads="1"/>
-                    </pic:cNvPicPr>
-                  </pic:nvPicPr>
-                  <pic:blipFill>
-                    <a:blip r:embed="rId8" cstate="print">
-                      <a:extLst>
-                        <a:ext uri="{28A0092B-C50C-407E-A947-70E740481C1C}">
-                          <a14:useLocalDpi xmlns:a14="http://schemas.microsoft.com/office/drawing/2010/main" val="0"/>
-                        </a:ext>
-                      </a:extLst>
-                    </a:blip>
-                    <a:srcRect/>
-                    <a:stretch>
-                      <a:fillRect/>
-                    </a:stretch>
-                  </pic:blipFill>
-                  <pic:spPr bwMode="auto">
-                    <a:xfrm>
-                      <a:off x="0" y="0"/>
-                      <a:ext cx="5731510" cy="3432810"/>
-                    </a:xfrm>
-                    <a:prstGeom prst="rect">
-                      <a:avLst/>
-                    </a:prstGeom>
-                    <a:noFill/>
-                    <a:ln>
-                      <a:noFill/>
-                    </a:ln>
-                  </pic:spPr>
-                </pic:pic>
-              </a:graphicData>
-            </a:graphic>
-          </wp:inline>
-        </w:drawing>
-      </w:r>
-    </w:p>
-    <w:p/>
-    <w:p>
-      <w:r>
-        <w:rPr>
-          <w:b/>
-          <w:bCs/>
-        </w:rPr>
-        <w:t>AWS S3 bucket:</w:t>
-      </w:r>
-    </w:p>
-    <w:p>
-      <w:r>
-        <w:drawing>
-          <wp:inline distT="0" distB="0" distL="0" distR="0" wp14:anchorId="3E196A7F" wp14:editId="1EBE44EA">
-            <wp:extent cx="5731510" cy="3432810"/>
-            <wp:effectExtent l="0" t="0" r="2540" b="0"/>
-            <wp:docPr id="843258531" name="Picture 10"/>
-            <wp:cNvGraphicFramePr>
-              <a:graphicFrameLocks xmlns:a="http://schemas.openxmlformats.org/drawingml/2006/main" noChangeAspect="1"/>
-            </wp:cNvGraphicFramePr>
-            <a:graphic xmlns:a="http://schemas.openxmlformats.org/drawingml/2006/main">
-              <a:graphicData uri="http://schemas.openxmlformats.org/drawingml/2006/picture">
-                <pic:pic xmlns:pic="http://schemas.openxmlformats.org/drawingml/2006/picture">
-                  <pic:nvPicPr>
-                    <pic:cNvPr id="0" name="Picture 174"/>
                     <pic:cNvPicPr>
                       <a:picLocks noChangeAspect="1" noChangeArrowheads="1"/>
                     </pic:cNvPicPr>
@@ -1777,17 +1695,20 @@
           <w:b/>
           <w:bCs/>
         </w:rPr>
-        <w:t>Jenkin pipeline success:</w:t>
-      </w:r>
-    </w:p>
-    <w:p>
-      <w:r>
+        <w:t>AWS S3 bucket:</w:t>
+      </w:r>
+    </w:p>
+    <w:p>
+      <w:r>
+        <w:rPr>
+          <w:noProof/>
+        </w:rPr>
         <w:lastRenderedPageBreak/>
         <w:drawing>
-          <wp:inline distT="0" distB="0" distL="0" distR="0" wp14:anchorId="70175A9B" wp14:editId="64F17910">
+          <wp:inline distT="0" distB="0" distL="0" distR="0" wp14:anchorId="3E196A7F" wp14:editId="1EBE44EA">
             <wp:extent cx="5731510" cy="3432810"/>
             <wp:effectExtent l="0" t="0" r="2540" b="0"/>
-            <wp:docPr id="1786835777" name="Picture 9"/>
+            <wp:docPr id="843258531" name="Picture 10"/>
             <wp:cNvGraphicFramePr>
               <a:graphicFrameLocks xmlns:a="http://schemas.openxmlformats.org/drawingml/2006/main" noChangeAspect="1"/>
             </wp:cNvGraphicFramePr>
@@ -1795,7 +1716,7 @@
               <a:graphicData uri="http://schemas.openxmlformats.org/drawingml/2006/picture">
                 <pic:pic xmlns:pic="http://schemas.openxmlformats.org/drawingml/2006/picture">
                   <pic:nvPicPr>
-                    <pic:cNvPr id="0" name="Picture 175"/>
+                    <pic:cNvPr id="0" name="Picture 174"/>
                     <pic:cNvPicPr>
                       <a:picLocks noChangeAspect="1" noChangeArrowheads="1"/>
                     </pic:cNvPicPr>
@@ -1840,320 +1761,19 @@
           <w:b/>
           <w:bCs/>
         </w:rPr>
-        <w:t>Groovy Script: </w:t>
-      </w:r>
-    </w:p>
-    <w:p>
-      <w:r>
-        <w:t>pipeline {</w:t>
-      </w:r>
-    </w:p>
-    <w:p>
-      <w:r>
-        <w:t>    agent any</w:t>
-      </w:r>
-    </w:p>
-    <w:p/>
-    <w:p>
-      <w:r>
-        <w:t>    stages {</w:t>
-      </w:r>
-    </w:p>
-    <w:p/>
-    <w:p>
-      <w:r>
-        <w:t>        </w:t>
-      </w:r>
-      <w:proofErr w:type="gramStart"/>
-      <w:r>
-        <w:t>stage(</w:t>
-      </w:r>
-      <w:proofErr w:type="gramEnd"/>
-      <w:r>
-        <w:t>'Clone Repo') {</w:t>
-      </w:r>
-    </w:p>
-    <w:p>
-      <w:r>
-        <w:t>            steps {</w:t>
-      </w:r>
-    </w:p>
-    <w:p>
-      <w:r>
-        <w:t>                git branch: 'sprint1', url: 'https://github.com/Priyanka-1920/Capstone-</w:t>
-      </w:r>
-      <w:proofErr w:type="spellStart"/>
-      <w:r>
-        <w:t>TradingGame.git</w:t>
-      </w:r>
-      <w:proofErr w:type="spellEnd"/>
-      <w:r>
-        <w:t>'</w:t>
-      </w:r>
-    </w:p>
-    <w:p>
-      <w:r>
-        <w:t>            }</w:t>
-      </w:r>
-    </w:p>
-    <w:p>
-      <w:r>
-        <w:t>        }</w:t>
-      </w:r>
-    </w:p>
-    <w:p/>
-    <w:p>
-      <w:r>
-        <w:t>        </w:t>
-      </w:r>
-      <w:proofErr w:type="gramStart"/>
-      <w:r>
-        <w:t>stage(</w:t>
-      </w:r>
-      <w:proofErr w:type="gramEnd"/>
-      <w:r>
-        <w:t>'Install Backend Dependencies') {</w:t>
-      </w:r>
-    </w:p>
-    <w:p>
-      <w:r>
-        <w:t>            steps {</w:t>
-      </w:r>
-    </w:p>
-    <w:p>
-      <w:r>
-        <w:t>                </w:t>
-      </w:r>
-      <w:proofErr w:type="spellStart"/>
-      <w:r>
-        <w:t>dir</w:t>
-      </w:r>
-      <w:proofErr w:type="spellEnd"/>
-      <w:r>
-        <w:t>('Server') {</w:t>
-      </w:r>
-    </w:p>
-    <w:p>
-      <w:r>
-        <w:lastRenderedPageBreak/>
-        <w:t>                    </w:t>
-      </w:r>
-      <w:proofErr w:type="spellStart"/>
-      <w:r>
-        <w:t>sh</w:t>
-      </w:r>
-      <w:proofErr w:type="spellEnd"/>
-      <w:r>
-        <w:t xml:space="preserve"> '</w:t>
-      </w:r>
-      <w:proofErr w:type="spellStart"/>
-      <w:r>
-        <w:t>npm</w:t>
-      </w:r>
-      <w:proofErr w:type="spellEnd"/>
-      <w:r>
-        <w:t xml:space="preserve"> install'</w:t>
-      </w:r>
-    </w:p>
-    <w:p>
-      <w:r>
-        <w:t>                }</w:t>
-      </w:r>
-    </w:p>
-    <w:p>
-      <w:r>
-        <w:t>            }</w:t>
-      </w:r>
-    </w:p>
-    <w:p>
-      <w:r>
-        <w:t>        }</w:t>
-      </w:r>
-    </w:p>
-    <w:p/>
-    <w:p>
-      <w:r>
-        <w:t>        </w:t>
-      </w:r>
-      <w:proofErr w:type="gramStart"/>
-      <w:r>
-        <w:t>stage(</w:t>
-      </w:r>
-      <w:proofErr w:type="gramEnd"/>
-      <w:r>
-        <w:t>'Basic Check') {</w:t>
-      </w:r>
-    </w:p>
-    <w:p>
-      <w:r>
-        <w:t>            steps {</w:t>
-      </w:r>
-    </w:p>
-    <w:p>
-      <w:r>
-        <w:t>                echo 'Backend dependencies installed successfully'</w:t>
-      </w:r>
-    </w:p>
-    <w:p>
-      <w:r>
-        <w:t>            }</w:t>
-      </w:r>
-    </w:p>
-    <w:p>
-      <w:r>
-        <w:t>        }</w:t>
-      </w:r>
-    </w:p>
-    <w:p/>
-    <w:p>
-      <w:r>
-        <w:t>        </w:t>
-      </w:r>
-      <w:proofErr w:type="gramStart"/>
-      <w:r>
-        <w:t>stage(</w:t>
-      </w:r>
-      <w:proofErr w:type="gramEnd"/>
-      <w:r>
-        <w:t>'Validate Docker Setup') {</w:t>
-      </w:r>
-    </w:p>
-    <w:p>
-      <w:r>
-        <w:t>            steps {</w:t>
-      </w:r>
-    </w:p>
-    <w:p>
-      <w:r>
-        <w:t>                </w:t>
-      </w:r>
-      <w:proofErr w:type="spellStart"/>
-      <w:r>
-        <w:t>sh</w:t>
-      </w:r>
-      <w:proofErr w:type="spellEnd"/>
-      <w:r>
-        <w:t xml:space="preserve"> 'docker --version'</w:t>
-      </w:r>
-    </w:p>
-    <w:p>
-      <w:r>
-        <w:t>            }</w:t>
-      </w:r>
-    </w:p>
-    <w:p>
-      <w:r>
-        <w:t>        }</w:t>
-      </w:r>
-    </w:p>
-    <w:p/>
-    <w:p>
-      <w:r>
-        <w:t>        </w:t>
-      </w:r>
-      <w:proofErr w:type="gramStart"/>
-      <w:r>
-        <w:t>stage(</w:t>
-      </w:r>
-      <w:proofErr w:type="gramEnd"/>
-      <w:r>
-        <w:t>'Validate Compose File (Basic)') {</w:t>
-      </w:r>
-    </w:p>
-    <w:p>
-      <w:r>
-        <w:t>            steps {</w:t>
-      </w:r>
-    </w:p>
-    <w:p>
-      <w:r>
-        <w:t>                </w:t>
-      </w:r>
-      <w:proofErr w:type="spellStart"/>
-      <w:r>
-        <w:t>sh</w:t>
-      </w:r>
-      <w:proofErr w:type="spellEnd"/>
-      <w:r>
-        <w:t xml:space="preserve"> 'ls -l docker-</w:t>
-      </w:r>
-      <w:proofErr w:type="spellStart"/>
-      <w:proofErr w:type="gramStart"/>
-      <w:r>
-        <w:t>compose.yaml</w:t>
-      </w:r>
-      <w:proofErr w:type="spellEnd"/>
-      <w:proofErr w:type="gramEnd"/>
-      <w:r>
-        <w:t>'</w:t>
-      </w:r>
-    </w:p>
-    <w:p>
-      <w:r>
-        <w:t>            }</w:t>
-      </w:r>
-    </w:p>
-    <w:p>
-      <w:r>
-        <w:t>        }</w:t>
-      </w:r>
-    </w:p>
-    <w:p>
-      <w:r>
-        <w:t>    }</w:t>
-      </w:r>
-    </w:p>
-    <w:p>
-      <w:r>
-        <w:t>}</w:t>
-      </w:r>
-    </w:p>
-    <w:p/>
-    <w:p>
-      <w:pPr>
-        <w:rPr>
-          <w:b/>
-          <w:bCs/>
-        </w:rPr>
-      </w:pPr>
-    </w:p>
-    <w:p>
-      <w:pPr>
-        <w:rPr>
-          <w:b/>
-          <w:bCs/>
-        </w:rPr>
-      </w:pPr>
-    </w:p>
-    <w:p>
-      <w:pPr>
-        <w:rPr>
-          <w:b/>
-          <w:bCs/>
-        </w:rPr>
-      </w:pPr>
-    </w:p>
-    <w:p>
-      <w:r>
-        <w:rPr>
-          <w:b/>
-          <w:bCs/>
-        </w:rPr>
-        <w:lastRenderedPageBreak/>
-        <w:t>GitHub Sprint1 Branch:</w:t>
-      </w:r>
-    </w:p>
-    <w:p>
-      <w:r>
-        <w:rPr>
-          <w:b/>
-          <w:bCs/>
+        <w:t>Jenkin pipeline success:</w:t>
+      </w:r>
+    </w:p>
+    <w:p>
+      <w:r>
+        <w:rPr>
+          <w:noProof/>
         </w:rPr>
         <w:drawing>
-          <wp:inline distT="0" distB="0" distL="0" distR="0" wp14:anchorId="4AFBEFA8" wp14:editId="48C266E0">
+          <wp:inline distT="0" distB="0" distL="0" distR="0" wp14:anchorId="70175A9B" wp14:editId="64F17910">
             <wp:extent cx="5731510" cy="3432810"/>
             <wp:effectExtent l="0" t="0" r="2540" b="0"/>
-            <wp:docPr id="473494567" name="Picture 8"/>
+            <wp:docPr id="1786835777" name="Picture 9"/>
             <wp:cNvGraphicFramePr>
               <a:graphicFrameLocks xmlns:a="http://schemas.openxmlformats.org/drawingml/2006/main" noChangeAspect="1"/>
             </wp:cNvGraphicFramePr>
@@ -2161,7 +1781,7 @@
               <a:graphicData uri="http://schemas.openxmlformats.org/drawingml/2006/picture">
                 <pic:pic xmlns:pic="http://schemas.openxmlformats.org/drawingml/2006/picture">
                   <pic:nvPicPr>
-                    <pic:cNvPr id="0" name="Picture 176"/>
+                    <pic:cNvPr id="0" name="Picture 175"/>
                     <pic:cNvPicPr>
                       <a:picLocks noChangeAspect="1" noChangeArrowheads="1"/>
                     </pic:cNvPicPr>
@@ -2199,6 +1819,275 @@
         </w:drawing>
       </w:r>
     </w:p>
+    <w:p/>
+    <w:p>
+      <w:r>
+        <w:rPr>
+          <w:b/>
+          <w:bCs/>
+        </w:rPr>
+        <w:t>Groovy Script: </w:t>
+      </w:r>
+    </w:p>
+    <w:p>
+      <w:r>
+        <w:t>pipeline {</w:t>
+      </w:r>
+    </w:p>
+    <w:p>
+      <w:r>
+        <w:lastRenderedPageBreak/>
+        <w:t>    agent any</w:t>
+      </w:r>
+    </w:p>
+    <w:p/>
+    <w:p>
+      <w:r>
+        <w:t>    stages {</w:t>
+      </w:r>
+    </w:p>
+    <w:p/>
+    <w:p>
+      <w:r>
+        <w:t>        stage('Clone Repo') {</w:t>
+      </w:r>
+    </w:p>
+    <w:p>
+      <w:r>
+        <w:t>            steps {</w:t>
+      </w:r>
+    </w:p>
+    <w:p>
+      <w:r>
+        <w:t>                git branch: 'sprint1', url: 'https://github.com/Priyanka-1920/Capstone-TradingGame.git'</w:t>
+      </w:r>
+    </w:p>
+    <w:p>
+      <w:r>
+        <w:t>            }</w:t>
+      </w:r>
+    </w:p>
+    <w:p>
+      <w:r>
+        <w:t>        }</w:t>
+      </w:r>
+    </w:p>
+    <w:p/>
+    <w:p>
+      <w:r>
+        <w:t>        stage('Install Backend Dependencies') {</w:t>
+      </w:r>
+    </w:p>
+    <w:p>
+      <w:r>
+        <w:t>            steps {</w:t>
+      </w:r>
+    </w:p>
+    <w:p>
+      <w:r>
+        <w:t>                dir('Server') {</w:t>
+      </w:r>
+    </w:p>
+    <w:p>
+      <w:r>
+        <w:t>                    sh 'npm install'</w:t>
+      </w:r>
+    </w:p>
+    <w:p>
+      <w:r>
+        <w:t>                }</w:t>
+      </w:r>
+    </w:p>
+    <w:p>
+      <w:r>
+        <w:t>            }</w:t>
+      </w:r>
+    </w:p>
+    <w:p>
+      <w:r>
+        <w:t>        }</w:t>
+      </w:r>
+    </w:p>
+    <w:p/>
+    <w:p>
+      <w:r>
+        <w:t>        stage('Basic Check') {</w:t>
+      </w:r>
+    </w:p>
+    <w:p>
+      <w:r>
+        <w:t>            steps {</w:t>
+      </w:r>
+    </w:p>
+    <w:p>
+      <w:r>
+        <w:t>                echo 'Backend dependencies installed successfully'</w:t>
+      </w:r>
+    </w:p>
+    <w:p>
+      <w:r>
+        <w:t>            }</w:t>
+      </w:r>
+    </w:p>
+    <w:p>
+      <w:r>
+        <w:t>        }</w:t>
+      </w:r>
+    </w:p>
+    <w:p/>
+    <w:p>
+      <w:r>
+        <w:t>        stage('Validate Docker Setup') {</w:t>
+      </w:r>
+    </w:p>
+    <w:p>
+      <w:r>
+        <w:t>            steps {</w:t>
+      </w:r>
+    </w:p>
+    <w:p>
+      <w:r>
+        <w:t>                sh 'docker --version'</w:t>
+      </w:r>
+    </w:p>
+    <w:p>
+      <w:r>
+        <w:lastRenderedPageBreak/>
+        <w:t>            }</w:t>
+      </w:r>
+    </w:p>
+    <w:p>
+      <w:r>
+        <w:t>        }</w:t>
+      </w:r>
+    </w:p>
+    <w:p/>
+    <w:p>
+      <w:r>
+        <w:t>        stage('Validate Compose File (Basic)') {</w:t>
+      </w:r>
+    </w:p>
+    <w:p>
+      <w:r>
+        <w:t>            steps {</w:t>
+      </w:r>
+    </w:p>
+    <w:p>
+      <w:r>
+        <w:t>                sh 'ls -l docker-compose.yaml'</w:t>
+      </w:r>
+    </w:p>
+    <w:p>
+      <w:r>
+        <w:t>            }</w:t>
+      </w:r>
+    </w:p>
+    <w:p>
+      <w:r>
+        <w:t>        }</w:t>
+      </w:r>
+    </w:p>
+    <w:p>
+      <w:r>
+        <w:t>    }</w:t>
+      </w:r>
+    </w:p>
+    <w:p>
+      <w:r>
+        <w:t>}</w:t>
+      </w:r>
+    </w:p>
+    <w:p/>
+    <w:p>
+      <w:pPr>
+        <w:rPr>
+          <w:b/>
+          <w:bCs/>
+        </w:rPr>
+      </w:pPr>
+    </w:p>
+    <w:p>
+      <w:pPr>
+        <w:rPr>
+          <w:b/>
+          <w:bCs/>
+        </w:rPr>
+      </w:pPr>
+    </w:p>
+    <w:p>
+      <w:pPr>
+        <w:rPr>
+          <w:b/>
+          <w:bCs/>
+        </w:rPr>
+      </w:pPr>
+    </w:p>
+    <w:p>
+      <w:r>
+        <w:rPr>
+          <w:b/>
+          <w:bCs/>
+        </w:rPr>
+        <w:t>GitHub Sprint1 Branch:</w:t>
+      </w:r>
+    </w:p>
+    <w:p>
+      <w:r>
+        <w:rPr>
+          <w:b/>
+          <w:bCs/>
+          <w:noProof/>
+        </w:rPr>
+        <w:drawing>
+          <wp:inline distT="0" distB="0" distL="0" distR="0" wp14:anchorId="4AFBEFA8" wp14:editId="48C266E0">
+            <wp:extent cx="5731510" cy="3432810"/>
+            <wp:effectExtent l="0" t="0" r="2540" b="0"/>
+            <wp:docPr id="473494567" name="Picture 8"/>
+            <wp:cNvGraphicFramePr>
+              <a:graphicFrameLocks xmlns:a="http://schemas.openxmlformats.org/drawingml/2006/main" noChangeAspect="1"/>
+            </wp:cNvGraphicFramePr>
+            <a:graphic xmlns:a="http://schemas.openxmlformats.org/drawingml/2006/main">
+              <a:graphicData uri="http://schemas.openxmlformats.org/drawingml/2006/picture">
+                <pic:pic xmlns:pic="http://schemas.openxmlformats.org/drawingml/2006/picture">
+                  <pic:nvPicPr>
+                    <pic:cNvPr id="0" name="Picture 176"/>
+                    <pic:cNvPicPr>
+                      <a:picLocks noChangeAspect="1" noChangeArrowheads="1"/>
+                    </pic:cNvPicPr>
+                  </pic:nvPicPr>
+                  <pic:blipFill>
+                    <a:blip r:embed="rId12" cstate="print">
+                      <a:extLst>
+                        <a:ext uri="{28A0092B-C50C-407E-A947-70E740481C1C}">
+                          <a14:useLocalDpi xmlns:a14="http://schemas.microsoft.com/office/drawing/2010/main" val="0"/>
+                        </a:ext>
+                      </a:extLst>
+                    </a:blip>
+                    <a:srcRect/>
+                    <a:stretch>
+                      <a:fillRect/>
+                    </a:stretch>
+                  </pic:blipFill>
+                  <pic:spPr bwMode="auto">
+                    <a:xfrm>
+                      <a:off x="0" y="0"/>
+                      <a:ext cx="5731510" cy="3432810"/>
+                    </a:xfrm>
+                    <a:prstGeom prst="rect">
+                      <a:avLst/>
+                    </a:prstGeom>
+                    <a:noFill/>
+                    <a:ln>
+                      <a:noFill/>
+                    </a:ln>
+                  </pic:spPr>
+                </pic:pic>
+              </a:graphicData>
+            </a:graphic>
+          </wp:inline>
+        </w:drawing>
+      </w:r>
+    </w:p>
     <w:p>
       <w:r>
         <w:br/>
@@ -2207,6 +2096,7 @@
         <w:br/>
       </w:r>
       <w:r>
+        <w:lastRenderedPageBreak/>
         <w:br/>
       </w:r>
       <w:r>
@@ -2249,7 +2139,7 @@
     <w:p>
       <w:r>
         <w:pict w14:anchorId="406474F9">
-          <v:rect id="_x0000_i1604" style="width:0;height:1.5pt" o:hralign="center" o:hrstd="t" o:hr="t" fillcolor="#a0a0a0" stroked="f"/>
+          <v:rect id="_x0000_i1043" style="width:0;height:1.5pt" o:hralign="center" o:hrstd="t" o:hr="t" fillcolor="#a0a0a0" stroked="f"/>
         </w:pict>
       </w:r>
     </w:p>
@@ -2276,7 +2166,7 @@
     <w:p>
       <w:r>
         <w:pict w14:anchorId="68E849B9">
-          <v:rect id="_x0000_i1605" style="width:0;height:1.5pt" o:hralign="center" o:hrstd="t" o:hr="t" fillcolor="#a0a0a0" stroked="f"/>
+          <v:rect id="_x0000_i1044" style="width:0;height:1.5pt" o:hralign="center" o:hrstd="t" o:hr="t" fillcolor="#a0a0a0" stroked="f"/>
         </w:pict>
       </w:r>
     </w:p>
@@ -2302,7 +2192,6 @@
     </w:p>
     <w:p>
       <w:r>
-        <w:lastRenderedPageBreak/>
         <w:t>VPC → Subnets → EKS Cluster → Node Group</w:t>
       </w:r>
     </w:p>
@@ -2310,7 +2199,7 @@
     <w:p>
       <w:r>
         <w:pict w14:anchorId="3261332C">
-          <v:rect id="_x0000_i1606" style="width:0;height:1.5pt" o:hralign="center" o:hrstd="t" o:hr="t" fillcolor="#a0a0a0" stroked="f"/>
+          <v:rect id="_x0000_i1045" style="width:0;height:1.5pt" o:hralign="center" o:hrstd="t" o:hr="t" fillcolor="#a0a0a0" stroked="f"/>
         </w:pict>
       </w:r>
     </w:p>
@@ -2369,7 +2258,7 @@
     <w:p>
       <w:r>
         <w:pict w14:anchorId="55F4E737">
-          <v:rect id="_x0000_i1607" style="width:0;height:1.5pt" o:hralign="center" o:hrstd="t" o:hr="t" fillcolor="#a0a0a0" stroked="f"/>
+          <v:rect id="_x0000_i1046" style="width:0;height:1.5pt" o:hralign="center" o:hrstd="t" o:hr="t" fillcolor="#a0a0a0" stroked="f"/>
         </w:pict>
       </w:r>
     </w:p>
@@ -2424,7 +2313,7 @@
     <w:p>
       <w:r>
         <w:pict w14:anchorId="2F5706B8">
-          <v:rect id="_x0000_i1608" style="width:0;height:1.5pt" o:hralign="center" o:hrstd="t" o:hr="t" fillcolor="#a0a0a0" stroked="f"/>
+          <v:rect id="_x0000_i1047" style="width:0;height:1.5pt" o:hralign="center" o:hrstd="t" o:hr="t" fillcolor="#a0a0a0" stroked="f"/>
         </w:pict>
       </w:r>
     </w:p>
@@ -2451,6 +2340,7 @@
         </w:numPr>
       </w:pPr>
       <w:r>
+        <w:lastRenderedPageBreak/>
         <w:t>Managed Kubernetes service</w:t>
       </w:r>
     </w:p>
@@ -2473,18 +2363,13 @@
         </w:numPr>
       </w:pPr>
       <w:r>
-        <w:t>Cluster Name: trading-</w:t>
-      </w:r>
-      <w:proofErr w:type="spellStart"/>
-      <w:r>
-        <w:t>eks</w:t>
-      </w:r>
-      <w:proofErr w:type="spellEnd"/>
+        <w:t>Cluster Name: trading-eks</w:t>
+      </w:r>
     </w:p>
     <w:p>
       <w:r>
         <w:pict w14:anchorId="38A97D3D">
-          <v:rect id="_x0000_i1609" style="width:0;height:1.5pt" o:hralign="center" o:hrstd="t" o:hr="t" fillcolor="#a0a0a0" stroked="f"/>
+          <v:rect id="_x0000_i1048" style="width:0;height:1.5pt" o:hralign="center" o:hrstd="t" o:hr="t" fillcolor="#a0a0a0" stroked="f"/>
         </w:pict>
       </w:r>
     </w:p>
@@ -2539,7 +2424,7 @@
     <w:p>
       <w:r>
         <w:pict w14:anchorId="59365012">
-          <v:rect id="_x0000_i1610" style="width:0;height:1.5pt" o:hralign="center" o:hrstd="t" o:hr="t" fillcolor="#a0a0a0" stroked="f"/>
+          <v:rect id="_x0000_i1049" style="width:0;height:1.5pt" o:hralign="center" o:hrstd="t" o:hr="t" fillcolor="#a0a0a0" stroked="f"/>
         </w:pict>
       </w:r>
     </w:p>
@@ -2590,7 +2475,6 @@
     </w:p>
     <w:p>
       <w:r>
-        <w:lastRenderedPageBreak/>
         <w:t>  variables.tf</w:t>
       </w:r>
     </w:p>
@@ -2598,7 +2482,7 @@
     <w:p>
       <w:r>
         <w:pict w14:anchorId="13AAA440">
-          <v:rect id="_x0000_i1611" style="width:0;height:1.5pt" o:hralign="center" o:hrstd="t" o:hr="t" fillcolor="#a0a0a0" stroked="f"/>
+          <v:rect id="_x0000_i1050" style="width:0;height:1.5pt" o:hralign="center" o:hrstd="t" o:hr="t" fillcolor="#a0a0a0" stroked="f"/>
         </w:pict>
       </w:r>
     </w:p>
@@ -2619,13 +2503,8 @@
     </w:p>
     <w:p>
       <w:r>
-        <w:t xml:space="preserve">terraform </w:t>
-      </w:r>
-      <w:proofErr w:type="spellStart"/>
-      <w:r>
-        <w:t>init</w:t>
-      </w:r>
-      <w:proofErr w:type="spellEnd"/>
+        <w:t>terraform init</w:t>
+      </w:r>
     </w:p>
     <w:p>
       <w:r>
@@ -2646,7 +2525,7 @@
     <w:p>
       <w:r>
         <w:pict w14:anchorId="146BD955">
-          <v:rect id="_x0000_i1612" style="width:0;height:1.5pt" o:hralign="center" o:hrstd="t" o:hr="t" fillcolor="#a0a0a0" stroked="f"/>
+          <v:rect id="_x0000_i1051" style="width:0;height:1.5pt" o:hralign="center" o:hrstd="t" o:hr="t" fillcolor="#a0a0a0" stroked="f"/>
         </w:pict>
       </w:r>
     </w:p>
@@ -2700,8 +2579,9 @@
     </w:p>
     <w:p>
       <w:r>
+        <w:lastRenderedPageBreak/>
         <w:pict w14:anchorId="087D608F">
-          <v:rect id="_x0000_i1613" style="width:0;height:1.5pt" o:hralign="center" o:hrstd="t" o:hr="t" fillcolor="#a0a0a0" stroked="f"/>
+          <v:rect id="_x0000_i1052" style="width:0;height:1.5pt" o:hralign="center" o:hrstd="t" o:hr="t" fillcolor="#a0a0a0" stroked="f"/>
         </w:pict>
       </w:r>
     </w:p>
@@ -2755,7 +2635,7 @@
     <w:p>
       <w:r>
         <w:pict w14:anchorId="4CEDF6C9">
-          <v:rect id="_x0000_i1614" style="width:0;height:1.5pt" o:hralign="center" o:hrstd="t" o:hr="t" fillcolor="#a0a0a0" stroked="f"/>
+          <v:rect id="_x0000_i1053" style="width:0;height:1.5pt" o:hralign="center" o:hrstd="t" o:hr="t" fillcolor="#a0a0a0" stroked="f"/>
         </w:pict>
       </w:r>
     </w:p>
@@ -2782,7 +2662,7 @@
     <w:p>
       <w:r>
         <w:pict w14:anchorId="602156A2">
-          <v:rect id="_x0000_i1615" style="width:0;height:1.5pt" o:hralign="center" o:hrstd="t" o:hr="t" fillcolor="#a0a0a0" stroked="f"/>
+          <v:rect id="_x0000_i1054" style="width:0;height:1.5pt" o:hralign="center" o:hrstd="t" o:hr="t" fillcolor="#a0a0a0" stroked="f"/>
         </w:pict>
       </w:r>
     </w:p>
@@ -2842,7 +2722,6 @@
         </w:numPr>
       </w:pPr>
       <w:r>
-        <w:lastRenderedPageBreak/>
         <w:t>Terraform Init</w:t>
       </w:r>
     </w:p>
@@ -2871,7 +2750,7 @@
     <w:p>
       <w:r>
         <w:pict w14:anchorId="7A0567FA">
-          <v:rect id="_x0000_i1616" style="width:0;height:1.5pt" o:hralign="center" o:hrstd="t" o:hr="t" fillcolor="#a0a0a0" stroked="f"/>
+          <v:rect id="_x0000_i1055" style="width:0;height:1.5pt" o:hralign="center" o:hrstd="t" o:hr="t" fillcolor="#a0a0a0" stroked="f"/>
         </w:pict>
       </w:r>
     </w:p>
@@ -2909,13 +2788,8 @@
         </w:numPr>
       </w:pPr>
       <w:r>
-        <w:t xml:space="preserve">Injected using </w:t>
-      </w:r>
-      <w:proofErr w:type="spellStart"/>
-      <w:r>
-        <w:t>withCredentials</w:t>
-      </w:r>
-      <w:proofErr w:type="spellEnd"/>
+        <w:t>Injected using withCredentials</w:t>
+      </w:r>
     </w:p>
     <w:p>
       <w:pPr>
@@ -2931,7 +2805,7 @@
     <w:p>
       <w:r>
         <w:pict w14:anchorId="3C72EDF0">
-          <v:rect id="_x0000_i1617" style="width:0;height:1.5pt" o:hralign="center" o:hrstd="t" o:hr="t" fillcolor="#a0a0a0" stroked="f"/>
+          <v:rect id="_x0000_i1056" style="width:0;height:1.5pt" o:hralign="center" o:hrstd="t" o:hr="t" fillcolor="#a0a0a0" stroked="f"/>
         </w:pict>
       </w:r>
     </w:p>
@@ -2956,30 +2830,21 @@
       </w:r>
     </w:p>
     <w:p>
-      <w:proofErr w:type="spellStart"/>
-      <w:r>
-        <w:t>kubectl</w:t>
-      </w:r>
-      <w:proofErr w:type="spellEnd"/>
-      <w:r>
-        <w:t xml:space="preserve"> get nodes</w:t>
-      </w:r>
-    </w:p>
-    <w:p>
-      <w:proofErr w:type="spellStart"/>
-      <w:r>
-        <w:t>kubectl</w:t>
-      </w:r>
-      <w:proofErr w:type="spellEnd"/>
-      <w:r>
-        <w:t xml:space="preserve"> get pods -A</w:t>
+      <w:r>
+        <w:t>kubectl get nodes</w:t>
+      </w:r>
+    </w:p>
+    <w:p>
+      <w:r>
+        <w:t>kubectl get pods -A</w:t>
       </w:r>
     </w:p>
     <w:p/>
     <w:p>
       <w:r>
+        <w:lastRenderedPageBreak/>
         <w:pict w14:anchorId="201EDD71">
-          <v:rect id="_x0000_i1618" style="width:0;height:1.5pt" o:hralign="center" o:hrstd="t" o:hr="t" fillcolor="#a0a0a0" stroked="f"/>
+          <v:rect id="_x0000_i1057" style="width:0;height:1.5pt" o:hralign="center" o:hrstd="t" o:hr="t" fillcolor="#a0a0a0" stroked="f"/>
         </w:pict>
       </w:r>
     </w:p>
@@ -3017,31 +2882,7 @@
         </w:numPr>
       </w:pPr>
       <w:r>
-        <w:t>System pods (</w:t>
-      </w:r>
-      <w:proofErr w:type="spellStart"/>
-      <w:r>
-        <w:t>coredns</w:t>
-      </w:r>
-      <w:proofErr w:type="spellEnd"/>
-      <w:r>
-        <w:t xml:space="preserve">, </w:t>
-      </w:r>
-      <w:proofErr w:type="spellStart"/>
-      <w:r>
-        <w:t>kube</w:t>
-      </w:r>
-      <w:proofErr w:type="spellEnd"/>
-      <w:r>
-        <w:t xml:space="preserve">-proxy, </w:t>
-      </w:r>
-      <w:proofErr w:type="spellStart"/>
-      <w:r>
-        <w:t>aws</w:t>
-      </w:r>
-      <w:proofErr w:type="spellEnd"/>
-      <w:r>
-        <w:t>-node) running</w:t>
+        <w:t>System pods (coredns, kube-proxy, aws-node) running</w:t>
       </w:r>
     </w:p>
     <w:p>
@@ -3058,7 +2899,7 @@
     <w:p>
       <w:r>
         <w:pict w14:anchorId="5B21F5F1">
-          <v:rect id="_x0000_i1619" style="width:0;height:1.5pt" o:hralign="center" o:hrstd="t" o:hr="t" fillcolor="#a0a0a0" stroked="f"/>
+          <v:rect id="_x0000_i1058" style="width:0;height:1.5pt" o:hralign="center" o:hrstd="t" o:hr="t" fillcolor="#a0a0a0" stroked="f"/>
         </w:pict>
       </w:r>
     </w:p>
@@ -3117,7 +2958,7 @@
     <w:p>
       <w:r>
         <w:pict w14:anchorId="40E4F9BD">
-          <v:rect id="_x0000_i1620" style="width:0;height:1.5pt" o:hralign="center" o:hrstd="t" o:hr="t" fillcolor="#a0a0a0" stroked="f"/>
+          <v:rect id="_x0000_i1059" style="width:0;height:1.5pt" o:hralign="center" o:hrstd="t" o:hr="t" fillcolor="#a0a0a0" stroked="f"/>
         </w:pict>
       </w:r>
     </w:p>
@@ -3144,15 +2985,7 @@
         </w:numPr>
       </w:pPr>
       <w:r>
-        <w:t>Issue</w:t>
-      </w:r>
-      <w:proofErr w:type="gramStart"/>
-      <w:r>
-        <w:t>: .terraform</w:t>
-      </w:r>
-      <w:proofErr w:type="gramEnd"/>
-      <w:r>
-        <w:t xml:space="preserve"> folder caused push failure</w:t>
+        <w:t>Issue: .terraform folder caused push failure</w:t>
       </w:r>
     </w:p>
     <w:p>
@@ -3163,24 +2996,13 @@
         </w:numPr>
       </w:pPr>
       <w:r>
-        <w:t xml:space="preserve">Fix: Removed from Git history and </w:t>
-      </w:r>
-      <w:proofErr w:type="gramStart"/>
-      <w:r>
-        <w:t>updated .</w:t>
-      </w:r>
-      <w:proofErr w:type="spellStart"/>
-      <w:r>
-        <w:t>gitignore</w:t>
-      </w:r>
-      <w:proofErr w:type="spellEnd"/>
-      <w:proofErr w:type="gramEnd"/>
-    </w:p>
-    <w:p>
-      <w:r>
-        <w:lastRenderedPageBreak/>
+        <w:t>Fix: Removed from Git history and updated .gitignore</w:t>
+      </w:r>
+    </w:p>
+    <w:p>
+      <w:r>
         <w:pict w14:anchorId="2B4DA3AC">
-          <v:rect id="_x0000_i1621" style="width:0;height:1.5pt" o:hralign="center" o:hrstd="t" o:hr="t" fillcolor="#a0a0a0" stroked="f"/>
+          <v:rect id="_x0000_i1060" style="width:0;height:1.5pt" o:hralign="center" o:hrstd="t" o:hr="t" fillcolor="#a0a0a0" stroked="f"/>
         </w:pict>
       </w:r>
     </w:p>
@@ -3224,7 +3046,7 @@
     <w:p>
       <w:r>
         <w:pict w14:anchorId="5C8CD96C">
-          <v:rect id="_x0000_i1622" style="width:0;height:1.5pt" o:hralign="center" o:hrstd="t" o:hr="t" fillcolor="#a0a0a0" stroked="f"/>
+          <v:rect id="_x0000_i1061" style="width:0;height:1.5pt" o:hralign="center" o:hrstd="t" o:hr="t" fillcolor="#a0a0a0" stroked="f"/>
         </w:pict>
       </w:r>
     </w:p>
@@ -3295,26 +3117,13 @@
         </w:numPr>
       </w:pPr>
       <w:r>
-        <w:t xml:space="preserve">Importance </w:t>
-      </w:r>
-      <w:proofErr w:type="gramStart"/>
-      <w:r>
-        <w:t>of .</w:t>
-      </w:r>
-      <w:proofErr w:type="spellStart"/>
-      <w:r>
-        <w:t>gitignore</w:t>
-      </w:r>
-      <w:proofErr w:type="spellEnd"/>
-      <w:proofErr w:type="gramEnd"/>
-      <w:r>
-        <w:t xml:space="preserve"> for Terraform</w:t>
+        <w:t>Importance of .gitignore for Terraform</w:t>
       </w:r>
     </w:p>
     <w:p>
       <w:r>
         <w:pict w14:anchorId="227DD935">
-          <v:rect id="_x0000_i1623" style="width:0;height:1.5pt" o:hralign="center" o:hrstd="t" o:hr="t" fillcolor="#a0a0a0" stroked="f"/>
+          <v:rect id="_x0000_i1062" style="width:0;height:1.5pt" o:hralign="center" o:hrstd="t" o:hr="t" fillcolor="#a0a0a0" stroked="f"/>
         </w:pict>
       </w:r>
     </w:p>
@@ -3338,6 +3147,7 @@
         <w:rPr>
           <w:rFonts w:ascii="Segoe UI Symbol" w:hAnsi="Segoe UI Symbol" w:cs="Segoe UI Symbol"/>
         </w:rPr>
+        <w:lastRenderedPageBreak/>
         <w:t>✔</w:t>
       </w:r>
       <w:r>
@@ -3365,13 +3175,8 @@
         <w:t>✔</w:t>
       </w:r>
       <w:r>
-        <w:t xml:space="preserve"> Cluster verified using </w:t>
-      </w:r>
-      <w:proofErr w:type="spellStart"/>
-      <w:r>
-        <w:t>kubectl</w:t>
-      </w:r>
-      <w:proofErr w:type="spellEnd"/>
+        <w:t xml:space="preserve"> Cluster verified using kubectl</w:t>
+      </w:r>
       <w:r>
         <w:br/>
       </w:r>
@@ -3400,7 +3205,7 @@
     <w:p>
       <w:r>
         <w:pict w14:anchorId="510278FB">
-          <v:rect id="_x0000_i1624" style="width:0;height:1.5pt" o:hralign="center" o:hrstd="t" o:hr="t" fillcolor="#a0a0a0" stroked="f"/>
+          <v:rect id="_x0000_i1063" style="width:0;height:1.5pt" o:hralign="center" o:hrstd="t" o:hr="t" fillcolor="#a0a0a0" stroked="f"/>
         </w:pict>
       </w:r>
     </w:p>
@@ -3460,18 +3265,13 @@
         </w:numPr>
       </w:pPr>
       <w:r>
-        <w:t xml:space="preserve">Expose application via </w:t>
-      </w:r>
-      <w:proofErr w:type="spellStart"/>
-      <w:r>
-        <w:t>LoadBalancer</w:t>
-      </w:r>
-      <w:proofErr w:type="spellEnd"/>
+        <w:t>Expose application via LoadBalancer</w:t>
+      </w:r>
     </w:p>
     <w:p>
       <w:r>
         <w:pict w14:anchorId="66E80DE6">
-          <v:rect id="_x0000_i1625" style="width:0;height:1.5pt" o:hralign="center" o:hrstd="t" o:hr="t" fillcolor="#a0a0a0" stroked="f"/>
+          <v:rect id="_x0000_i1064" style="width:0;height:1.5pt" o:hralign="center" o:hrstd="t" o:hr="t" fillcolor="#a0a0a0" stroked="f"/>
         </w:pict>
       </w:r>
     </w:p>
@@ -3497,9 +3297,8 @@
     </w:p>
     <w:p>
       <w:r>
-        <w:lastRenderedPageBreak/>
         <w:pict w14:anchorId="6F6A0CCA">
-          <v:rect id="_x0000_i1626" style="width:0;height:1.5pt" o:hralign="center" o:hrstd="t" o:hr="t" fillcolor="#a0a0a0" stroked="f"/>
+          <v:rect id="_x0000_i1065" style="width:0;height:1.5pt" o:hralign="center" o:hrstd="t" o:hr="t" fillcolor="#a0a0a0" stroked="f"/>
         </w:pict>
       </w:r>
     </w:p>
@@ -3544,26 +3343,18 @@
     <w:p/>
     <w:p>
       <w:r>
+        <w:lastRenderedPageBreak/>
         <w:t>Node group</w:t>
       </w:r>
     </w:p>
     <w:p/>
     <w:p>
-      <w:proofErr w:type="spellStart"/>
-      <w:r>
-        <w:rPr>
-          <w:b/>
-          <w:bCs/>
-        </w:rPr>
-        <w:t>Github</w:t>
-      </w:r>
-      <w:proofErr w:type="spellEnd"/>
-      <w:r>
-        <w:rPr>
-          <w:b/>
-          <w:bCs/>
-        </w:rPr>
-        <w:t xml:space="preserve"> Sprint 2- branch:</w:t>
+      <w:r>
+        <w:rPr>
+          <w:b/>
+          <w:bCs/>
+        </w:rPr>
+        <w:t>Github Sprint 2- branch:</w:t>
       </w:r>
     </w:p>
     <w:p/>
@@ -3616,22 +3407,76 @@
     <w:p/>
     <w:p>
       <w:r>
+        <w:t>    stages {</w:t>
+      </w:r>
+    </w:p>
+    <w:p/>
+    <w:p>
+      <w:r>
+        <w:t>        stage('Clone Repo') {</w:t>
+      </w:r>
+    </w:p>
+    <w:p>
+      <w:r>
+        <w:t>            steps {</w:t>
+      </w:r>
+    </w:p>
+    <w:p>
+      <w:r>
+        <w:t>                git branch: 'sprint2', url: 'https://github.com/Priyanka-1920/Capstone-TradingGame.git'</w:t>
+      </w:r>
+    </w:p>
+    <w:p>
+      <w:r>
+        <w:t>            }</w:t>
+      </w:r>
+    </w:p>
+    <w:p>
+      <w:r>
+        <w:t>        }</w:t>
+      </w:r>
+    </w:p>
+    <w:p/>
+    <w:p>
+      <w:r>
+        <w:t>        stage('Install Backend Dependencies') {</w:t>
+      </w:r>
+    </w:p>
+    <w:p>
+      <w:r>
+        <w:t>            steps {</w:t>
+      </w:r>
+    </w:p>
+    <w:p>
+      <w:r>
+        <w:t>                dir('Server') {</w:t>
+      </w:r>
+    </w:p>
+    <w:p>
+      <w:r>
+        <w:t>                    sh 'npm install'</w:t>
+      </w:r>
+    </w:p>
+    <w:p>
+      <w:r>
         <w:lastRenderedPageBreak/>
-        <w:t>    stages {</w:t>
+        <w:t>                }</w:t>
+      </w:r>
+    </w:p>
+    <w:p>
+      <w:r>
+        <w:t>            }</w:t>
+      </w:r>
+    </w:p>
+    <w:p>
+      <w:r>
+        <w:t>        }</w:t>
       </w:r>
     </w:p>
     <w:p/>
     <w:p>
       <w:r>
-        <w:t>        </w:t>
-      </w:r>
-      <w:proofErr w:type="gramStart"/>
-      <w:r>
-        <w:t>stage(</w:t>
-      </w:r>
-      <w:proofErr w:type="gramEnd"/>
-      <w:r>
-        <w:t>'Clone Repo') {</w:t>
+        <w:t>        stage('Basic Check') {</w:t>
       </w:r>
     </w:p>
     <w:p>
@@ -3641,15 +3486,7 @@
     </w:p>
     <w:p>
       <w:r>
-        <w:t>                git branch: 'sprint2', url: 'https://github.com/Priyanka-1920/Capstone-</w:t>
-      </w:r>
-      <w:proofErr w:type="spellStart"/>
-      <w:r>
-        <w:t>TradingGame.git</w:t>
-      </w:r>
-      <w:proofErr w:type="spellEnd"/>
-      <w:r>
-        <w:t>'</w:t>
+        <w:t>                echo 'Backend setup verified successfully'</w:t>
       </w:r>
     </w:p>
     <w:p>
@@ -3665,15 +3502,7 @@
     <w:p/>
     <w:p>
       <w:r>
-        <w:t>        </w:t>
-      </w:r>
-      <w:proofErr w:type="gramStart"/>
-      <w:r>
-        <w:t>stage(</w:t>
-      </w:r>
-      <w:proofErr w:type="gramEnd"/>
-      <w:r>
-        <w:t>'Install Backend Dependencies') {</w:t>
+        <w:t>        stage('Terraform Init') {</w:t>
       </w:r>
     </w:p>
     <w:p>
@@ -3683,36 +3512,62 @@
     </w:p>
     <w:p>
       <w:r>
-        <w:t>                </w:t>
-      </w:r>
-      <w:proofErr w:type="spellStart"/>
-      <w:r>
-        <w:t>dir</w:t>
-      </w:r>
-      <w:proofErr w:type="spellEnd"/>
-      <w:r>
-        <w:t>('Server') {</w:t>
-      </w:r>
-    </w:p>
-    <w:p>
-      <w:r>
-        <w:t>                    </w:t>
-      </w:r>
-      <w:proofErr w:type="spellStart"/>
-      <w:r>
-        <w:t>sh</w:t>
-      </w:r>
-      <w:proofErr w:type="spellEnd"/>
-      <w:r>
-        <w:t xml:space="preserve"> '</w:t>
-      </w:r>
-      <w:proofErr w:type="spellStart"/>
-      <w:r>
-        <w:t>npm</w:t>
-      </w:r>
-      <w:proofErr w:type="spellEnd"/>
-      <w:r>
-        <w:t xml:space="preserve"> install'</w:t>
+        <w:t>                withCredentials([usernamePassword(</w:t>
+      </w:r>
+    </w:p>
+    <w:p>
+      <w:r>
+        <w:t>                    credentialsId: 'aws-creds',</w:t>
+      </w:r>
+    </w:p>
+    <w:p>
+      <w:r>
+        <w:t>                    usernameVariable: 'AWS_ACCESS_KEY_ID',</w:t>
+      </w:r>
+    </w:p>
+    <w:p>
+      <w:r>
+        <w:t>                    passwordVariable: 'AWS_SECRET_ACCESS_KEY'</w:t>
+      </w:r>
+    </w:p>
+    <w:p>
+      <w:r>
+        <w:t>                )]) {</w:t>
+      </w:r>
+    </w:p>
+    <w:p>
+      <w:r>
+        <w:t>                    dir('terraform') {</w:t>
+      </w:r>
+    </w:p>
+    <w:p>
+      <w:r>
+        <w:t>                        sh '''</w:t>
+      </w:r>
+    </w:p>
+    <w:p>
+      <w:r>
+        <w:t>                        export AWS_ACCESS_KEY_ID=$AWS_ACCESS_KEY_ID</w:t>
+      </w:r>
+    </w:p>
+    <w:p>
+      <w:r>
+        <w:t>                        export AWS_SECRET_ACCESS_KEY=$AWS_SECRET_ACCESS_KEY</w:t>
+      </w:r>
+    </w:p>
+    <w:p>
+      <w:r>
+        <w:t>                        terraform init</w:t>
+      </w:r>
+    </w:p>
+    <w:p>
+      <w:r>
+        <w:t>                        '''</w:t>
+      </w:r>
+    </w:p>
+    <w:p>
+      <w:r>
+        <w:t>                    }</w:t>
       </w:r>
     </w:p>
     <w:p>
@@ -3733,15 +3588,8 @@
     <w:p/>
     <w:p>
       <w:r>
-        <w:t>        </w:t>
-      </w:r>
-      <w:proofErr w:type="gramStart"/>
-      <w:r>
-        <w:t>stage(</w:t>
-      </w:r>
-      <w:proofErr w:type="gramEnd"/>
-      <w:r>
-        <w:t>'Basic Check') {</w:t>
+        <w:lastRenderedPageBreak/>
+        <w:t>        stage('Terraform Validate') {</w:t>
       </w:r>
     </w:p>
     <w:p>
@@ -3751,7 +3599,17 @@
     </w:p>
     <w:p>
       <w:r>
-        <w:t>                echo 'Backend setup verified successfully'</w:t>
+        <w:t>                dir('terraform') {</w:t>
+      </w:r>
+    </w:p>
+    <w:p>
+      <w:r>
+        <w:t>                    sh 'terraform validate'</w:t>
+      </w:r>
+    </w:p>
+    <w:p>
+      <w:r>
+        <w:t>                }</w:t>
       </w:r>
     </w:p>
     <w:p>
@@ -3767,15 +3625,7 @@
     <w:p/>
     <w:p>
       <w:r>
-        <w:t>        </w:t>
-      </w:r>
-      <w:proofErr w:type="gramStart"/>
-      <w:r>
-        <w:t>stage(</w:t>
-      </w:r>
-      <w:proofErr w:type="gramEnd"/>
-      <w:r>
-        <w:t>'Terraform Init') {</w:t>
+        <w:t>        stage('Terraform Plan') {</w:t>
       </w:r>
     </w:p>
     <w:p>
@@ -3785,149 +3635,109 @@
     </w:p>
     <w:p>
       <w:r>
-        <w:t>                </w:t>
-      </w:r>
-      <w:proofErr w:type="spellStart"/>
-      <w:proofErr w:type="gramStart"/>
-      <w:r>
-        <w:t>withCredentials</w:t>
-      </w:r>
-      <w:proofErr w:type="spellEnd"/>
-      <w:r>
-        <w:t>(</w:t>
-      </w:r>
-      <w:proofErr w:type="gramEnd"/>
-      <w:r>
-        <w:t>[</w:t>
-      </w:r>
-      <w:proofErr w:type="spellStart"/>
-      <w:proofErr w:type="gramStart"/>
-      <w:r>
-        <w:t>usernamePassword</w:t>
-      </w:r>
-      <w:proofErr w:type="spellEnd"/>
-      <w:r>
-        <w:t>(</w:t>
-      </w:r>
-      <w:proofErr w:type="gramEnd"/>
-    </w:p>
-    <w:p>
-      <w:r>
-        <w:t>                    </w:t>
-      </w:r>
-      <w:proofErr w:type="spellStart"/>
-      <w:r>
-        <w:t>credentialsId</w:t>
-      </w:r>
-      <w:proofErr w:type="spellEnd"/>
-      <w:r>
-        <w:t>: '</w:t>
-      </w:r>
-      <w:proofErr w:type="spellStart"/>
-      <w:r>
-        <w:t>aws</w:t>
-      </w:r>
-      <w:proofErr w:type="spellEnd"/>
-      <w:r>
-        <w:t>-creds',</w:t>
-      </w:r>
-    </w:p>
-    <w:p>
-      <w:r>
-        <w:t>                    </w:t>
-      </w:r>
-      <w:proofErr w:type="spellStart"/>
-      <w:r>
-        <w:t>usernameVariable</w:t>
-      </w:r>
-      <w:proofErr w:type="spellEnd"/>
-      <w:r>
-        <w:t>: 'AWS_ACCESS_KEY_ID',</w:t>
-      </w:r>
-    </w:p>
+        <w:t>                withCredentials([usernamePassword(</w:t>
+      </w:r>
+    </w:p>
+    <w:p>
+      <w:r>
+        <w:t>                    credentialsId: 'aws-creds',</w:t>
+      </w:r>
+    </w:p>
+    <w:p>
+      <w:r>
+        <w:t>                    usernameVariable: 'AWS_ACCESS_KEY_ID',</w:t>
+      </w:r>
+    </w:p>
+    <w:p>
+      <w:r>
+        <w:t>                    passwordVariable: 'AWS_SECRET_ACCESS_KEY'</w:t>
+      </w:r>
+    </w:p>
+    <w:p>
+      <w:r>
+        <w:t>                )]) {</w:t>
+      </w:r>
+    </w:p>
+    <w:p>
+      <w:r>
+        <w:t>                    dir('terraform') {</w:t>
+      </w:r>
+    </w:p>
+    <w:p>
+      <w:r>
+        <w:t>                        sh '''</w:t>
+      </w:r>
+    </w:p>
+    <w:p>
+      <w:r>
+        <w:t>                        export AWS_ACCESS_KEY_ID=$AWS_ACCESS_KEY_ID</w:t>
+      </w:r>
+    </w:p>
+    <w:p>
+      <w:r>
+        <w:t>                        export AWS_SECRET_ACCESS_KEY=$AWS_SECRET_ACCESS_KEY</w:t>
+      </w:r>
+    </w:p>
+    <w:p>
+      <w:r>
+        <w:t>                        terraform plan</w:t>
+      </w:r>
+    </w:p>
+    <w:p>
+      <w:r>
+        <w:t>                        '''</w:t>
+      </w:r>
+    </w:p>
+    <w:p>
+      <w:r>
+        <w:t>                    }</w:t>
+      </w:r>
+    </w:p>
+    <w:p>
+      <w:r>
+        <w:t>                }</w:t>
+      </w:r>
+    </w:p>
+    <w:p>
+      <w:r>
+        <w:t>            }</w:t>
+      </w:r>
+    </w:p>
+    <w:p>
+      <w:r>
+        <w:t>        }</w:t>
+      </w:r>
+    </w:p>
+    <w:p/>
+    <w:p>
+      <w:r>
+        <w:t>    }</w:t>
+      </w:r>
+    </w:p>
+    <w:p/>
     <w:p>
       <w:r>
         <w:lastRenderedPageBreak/>
-        <w:t>                    </w:t>
-      </w:r>
-      <w:proofErr w:type="spellStart"/>
-      <w:r>
-        <w:t>passwordVariable</w:t>
-      </w:r>
-      <w:proofErr w:type="spellEnd"/>
-      <w:r>
-        <w:t>: 'AWS_SECRET_ACCESS_KEY'</w:t>
-      </w:r>
-    </w:p>
-    <w:p>
-      <w:r>
-        <w:t>                )]) {</w:t>
-      </w:r>
-    </w:p>
-    <w:p>
-      <w:r>
-        <w:t>                    </w:t>
-      </w:r>
-      <w:proofErr w:type="spellStart"/>
-      <w:r>
-        <w:t>dir</w:t>
-      </w:r>
-      <w:proofErr w:type="spellEnd"/>
-      <w:r>
-        <w:t>('terraform') {</w:t>
-      </w:r>
-    </w:p>
-    <w:p>
-      <w:r>
-        <w:t>                        </w:t>
-      </w:r>
-      <w:proofErr w:type="spellStart"/>
-      <w:r>
-        <w:t>sh</w:t>
-      </w:r>
-      <w:proofErr w:type="spellEnd"/>
-      <w:r>
-        <w:t xml:space="preserve"> '''</w:t>
-      </w:r>
-    </w:p>
-    <w:p>
-      <w:r>
-        <w:t>                        export AWS_ACCESS_KEY_ID=$AWS_ACCESS_KEY_ID</w:t>
-      </w:r>
-    </w:p>
-    <w:p>
-      <w:r>
-        <w:t>                        export AWS_SECRET_ACCESS_KEY=$AWS_SECRET_ACCESS_KEY</w:t>
-      </w:r>
-    </w:p>
-    <w:p>
-      <w:r>
-        <w:t xml:space="preserve">                        terraform </w:t>
-      </w:r>
-      <w:proofErr w:type="spellStart"/>
-      <w:r>
-        <w:t>init</w:t>
-      </w:r>
-      <w:proofErr w:type="spellEnd"/>
-    </w:p>
-    <w:p>
-      <w:r>
-        <w:t>                        '''</w:t>
-      </w:r>
-    </w:p>
-    <w:p>
-      <w:r>
-        <w:t>                    }</w:t>
-      </w:r>
-    </w:p>
-    <w:p>
-      <w:r>
-        <w:t>                }</w:t>
-      </w:r>
-    </w:p>
-    <w:p>
-      <w:r>
-        <w:t>            }</w:t>
+        <w:t>    post {</w:t>
+      </w:r>
+    </w:p>
+    <w:p>
+      <w:r>
+        <w:t>        success {</w:t>
+      </w:r>
+    </w:p>
+    <w:p>
+      <w:r>
+        <w:t>            echo '</w:t>
+      </w:r>
+      <w:r>
+        <w:rPr>
+          <w:rFonts w:ascii="Segoe UI Emoji" w:hAnsi="Segoe UI Emoji" w:cs="Segoe UI Emoji"/>
+        </w:rPr>
+        <w:t>✅</w:t>
+      </w:r>
+      <w:r>
+        <w:t xml:space="preserve"> Pipeline executed successfully!'</w:t>
       </w:r>
     </w:p>
     <w:p>
@@ -3935,418 +3745,139 @@
         <w:t>        }</w:t>
       </w:r>
     </w:p>
+    <w:p>
+      <w:r>
+        <w:t>        failure {</w:t>
+      </w:r>
+    </w:p>
+    <w:p>
+      <w:r>
+        <w:t>            echo '</w:t>
+      </w:r>
+      <w:r>
+        <w:rPr>
+          <w:rFonts w:ascii="Segoe UI Emoji" w:hAnsi="Segoe UI Emoji" w:cs="Segoe UI Emoji"/>
+        </w:rPr>
+        <w:t>❌</w:t>
+      </w:r>
+      <w:r>
+        <w:t xml:space="preserve"> Pipeline failed. Check logs for errors.'</w:t>
+      </w:r>
+    </w:p>
+    <w:p>
+      <w:r>
+        <w:t>        }</w:t>
+      </w:r>
+    </w:p>
+    <w:p>
+      <w:r>
+        <w:t>    }</w:t>
+      </w:r>
+    </w:p>
+    <w:p>
+      <w:r>
+        <w:t>}</w:t>
+      </w:r>
+    </w:p>
+    <w:p>
+      <w:r>
+        <w:br/>
+      </w:r>
+    </w:p>
+    <w:p>
+      <w:r>
+        <w:t>—-------------------------------------------------------------------------------------------—------------------</w:t>
+      </w:r>
+    </w:p>
+    <w:p>
+      <w:pPr>
+        <w:rPr>
+          <w:b/>
+          <w:bCs/>
+        </w:rPr>
+      </w:pPr>
+      <w:r>
+        <w:rPr>
+          <w:b/>
+          <w:bCs/>
+        </w:rPr>
+        <w:t>DevOps Capstone Project – Trading Game</w:t>
+      </w:r>
+    </w:p>
+    <w:p>
+      <w:pPr>
+        <w:rPr>
+          <w:b/>
+          <w:bCs/>
+        </w:rPr>
+      </w:pPr>
+      <w:r>
+        <w:rPr>
+          <w:b/>
+          <w:bCs/>
+        </w:rPr>
+        <w:t>Sprint 3: Configuration Management using Ansible</w:t>
+      </w:r>
+    </w:p>
+    <w:p>
+      <w:r>
+        <w:pict w14:anchorId="52799239">
+          <v:rect id="_x0000_i1066" style="width:0;height:1.5pt" o:hralign="center" o:hrstd="t" o:hr="t" fillcolor="#a0a0a0" stroked="f"/>
+        </w:pict>
+      </w:r>
+    </w:p>
+    <w:p>
+      <w:pPr>
+        <w:rPr>
+          <w:b/>
+          <w:bCs/>
+        </w:rPr>
+      </w:pPr>
+      <w:r>
+        <w:rPr>
+          <w:b/>
+          <w:bCs/>
+        </w:rPr>
+        <w:t> Objective</w:t>
+      </w:r>
+    </w:p>
+    <w:p>
+      <w:r>
+        <w:t>The objective of Sprint 3 is to automate server configuration using Ansible and ensure consistent setup of EC2 instances. This includes installing required tools like Docker and kubectl, and integrating the process with Jenkins.</w:t>
+      </w:r>
+    </w:p>
+    <w:p>
+      <w:r>
+        <w:pict w14:anchorId="1CEB83D4">
+          <v:rect id="_x0000_i1067" style="width:0;height:1.5pt" o:hralign="center" o:hrstd="t" o:hr="t" fillcolor="#a0a0a0" stroked="f"/>
+        </w:pict>
+      </w:r>
+    </w:p>
+    <w:p>
+      <w:pPr>
+        <w:rPr>
+          <w:b/>
+          <w:bCs/>
+        </w:rPr>
+      </w:pPr>
+      <w:r>
+        <w:rPr>
+          <w:b/>
+          <w:bCs/>
+        </w:rPr>
+        <w:t> Architecture Overview</w:t>
+      </w:r>
+    </w:p>
+    <w:p>
+      <w:r>
+        <w:t>Local Machine (Ansible) → SSH → AWS EC2 → Configuration (Docker, kubectl)</w:t>
+      </w:r>
+    </w:p>
     <w:p/>
     <w:p>
       <w:r>
-        <w:t>        </w:t>
-      </w:r>
-      <w:proofErr w:type="gramStart"/>
-      <w:r>
-        <w:t>stage(</w:t>
-      </w:r>
-      <w:proofErr w:type="gramEnd"/>
-      <w:r>
-        <w:t>'Terraform Validate') {</w:t>
-      </w:r>
-    </w:p>
-    <w:p>
-      <w:r>
-        <w:t>            steps {</w:t>
-      </w:r>
-    </w:p>
-    <w:p>
-      <w:r>
-        <w:t>                </w:t>
-      </w:r>
-      <w:proofErr w:type="spellStart"/>
-      <w:r>
-        <w:t>dir</w:t>
-      </w:r>
-      <w:proofErr w:type="spellEnd"/>
-      <w:r>
-        <w:t>('terraform') {</w:t>
-      </w:r>
-    </w:p>
-    <w:p>
-      <w:r>
-        <w:t>                    </w:t>
-      </w:r>
-      <w:proofErr w:type="spellStart"/>
-      <w:r>
-        <w:t>sh</w:t>
-      </w:r>
-      <w:proofErr w:type="spellEnd"/>
-      <w:r>
-        <w:t xml:space="preserve"> 'terraform validate'</w:t>
-      </w:r>
-    </w:p>
-    <w:p>
-      <w:r>
-        <w:t>                }</w:t>
-      </w:r>
-    </w:p>
-    <w:p>
-      <w:r>
-        <w:t>            }</w:t>
-      </w:r>
-    </w:p>
-    <w:p>
-      <w:r>
-        <w:t>        }</w:t>
-      </w:r>
-    </w:p>
-    <w:p/>
-    <w:p>
-      <w:r>
-        <w:t>        </w:t>
-      </w:r>
-      <w:proofErr w:type="gramStart"/>
-      <w:r>
-        <w:t>stage(</w:t>
-      </w:r>
-      <w:proofErr w:type="gramEnd"/>
-      <w:r>
-        <w:t>'Terraform Plan') {</w:t>
-      </w:r>
-    </w:p>
-    <w:p>
-      <w:r>
-        <w:t>            steps {</w:t>
-      </w:r>
-    </w:p>
-    <w:p>
-      <w:r>
-        <w:t>                </w:t>
-      </w:r>
-      <w:proofErr w:type="spellStart"/>
-      <w:proofErr w:type="gramStart"/>
-      <w:r>
-        <w:t>withCredentials</w:t>
-      </w:r>
-      <w:proofErr w:type="spellEnd"/>
-      <w:r>
-        <w:t>(</w:t>
-      </w:r>
-      <w:proofErr w:type="gramEnd"/>
-      <w:r>
-        <w:t>[</w:t>
-      </w:r>
-      <w:proofErr w:type="spellStart"/>
-      <w:proofErr w:type="gramStart"/>
-      <w:r>
-        <w:t>usernamePassword</w:t>
-      </w:r>
-      <w:proofErr w:type="spellEnd"/>
-      <w:r>
-        <w:t>(</w:t>
-      </w:r>
-      <w:proofErr w:type="gramEnd"/>
-    </w:p>
-    <w:p>
-      <w:r>
-        <w:t>                    </w:t>
-      </w:r>
-      <w:proofErr w:type="spellStart"/>
-      <w:r>
-        <w:t>credentialsId</w:t>
-      </w:r>
-      <w:proofErr w:type="spellEnd"/>
-      <w:r>
-        <w:t>: '</w:t>
-      </w:r>
-      <w:proofErr w:type="spellStart"/>
-      <w:r>
-        <w:t>aws</w:t>
-      </w:r>
-      <w:proofErr w:type="spellEnd"/>
-      <w:r>
-        <w:t>-creds',</w:t>
-      </w:r>
-    </w:p>
-    <w:p>
-      <w:r>
-        <w:t>                    </w:t>
-      </w:r>
-      <w:proofErr w:type="spellStart"/>
-      <w:r>
-        <w:t>usernameVariable</w:t>
-      </w:r>
-      <w:proofErr w:type="spellEnd"/>
-      <w:r>
-        <w:t>: 'AWS_ACCESS_KEY_ID',</w:t>
-      </w:r>
-    </w:p>
-    <w:p>
-      <w:r>
-        <w:t>                    </w:t>
-      </w:r>
-      <w:proofErr w:type="spellStart"/>
-      <w:r>
-        <w:t>passwordVariable</w:t>
-      </w:r>
-      <w:proofErr w:type="spellEnd"/>
-      <w:r>
-        <w:t>: 'AWS_SECRET_ACCESS_KEY'</w:t>
-      </w:r>
-    </w:p>
-    <w:p>
-      <w:r>
-        <w:t>                )]) {</w:t>
-      </w:r>
-    </w:p>
-    <w:p>
-      <w:r>
-        <w:lastRenderedPageBreak/>
-        <w:t>                    </w:t>
-      </w:r>
-      <w:proofErr w:type="spellStart"/>
-      <w:r>
-        <w:t>dir</w:t>
-      </w:r>
-      <w:proofErr w:type="spellEnd"/>
-      <w:r>
-        <w:t>('terraform') {</w:t>
-      </w:r>
-    </w:p>
-    <w:p>
-      <w:r>
-        <w:t>                        </w:t>
-      </w:r>
-      <w:proofErr w:type="spellStart"/>
-      <w:r>
-        <w:t>sh</w:t>
-      </w:r>
-      <w:proofErr w:type="spellEnd"/>
-      <w:r>
-        <w:t xml:space="preserve"> '''</w:t>
-      </w:r>
-    </w:p>
-    <w:p>
-      <w:r>
-        <w:t>                        export AWS_ACCESS_KEY_ID=$AWS_ACCESS_KEY_ID</w:t>
-      </w:r>
-    </w:p>
-    <w:p>
-      <w:r>
-        <w:t>                        export AWS_SECRET_ACCESS_KEY=$AWS_SECRET_ACCESS_KEY</w:t>
-      </w:r>
-    </w:p>
-    <w:p>
-      <w:r>
-        <w:t>                        terraform plan</w:t>
-      </w:r>
-    </w:p>
-    <w:p>
-      <w:r>
-        <w:t>                        '''</w:t>
-      </w:r>
-    </w:p>
-    <w:p>
-      <w:r>
-        <w:t>                    }</w:t>
-      </w:r>
-    </w:p>
-    <w:p>
-      <w:r>
-        <w:t>                }</w:t>
-      </w:r>
-    </w:p>
-    <w:p>
-      <w:r>
-        <w:t>            }</w:t>
-      </w:r>
-    </w:p>
-    <w:p>
-      <w:r>
-        <w:t>        }</w:t>
-      </w:r>
-    </w:p>
-    <w:p/>
-    <w:p>
-      <w:r>
-        <w:t>    }</w:t>
-      </w:r>
-    </w:p>
-    <w:p/>
-    <w:p>
-      <w:r>
-        <w:t>    post {</w:t>
-      </w:r>
-    </w:p>
-    <w:p>
-      <w:r>
-        <w:t>        success {</w:t>
-      </w:r>
-    </w:p>
-    <w:p>
-      <w:r>
-        <w:t>            echo '</w:t>
-      </w:r>
-      <w:r>
-        <w:rPr>
-          <w:rFonts w:ascii="Segoe UI Emoji" w:hAnsi="Segoe UI Emoji" w:cs="Segoe UI Emoji"/>
-        </w:rPr>
-        <w:t>✅</w:t>
-      </w:r>
-      <w:r>
-        <w:t xml:space="preserve"> Pipeline executed successfully!'</w:t>
-      </w:r>
-    </w:p>
-    <w:p>
-      <w:r>
-        <w:t>        }</w:t>
-      </w:r>
-    </w:p>
-    <w:p>
-      <w:r>
-        <w:t>        failure {</w:t>
-      </w:r>
-    </w:p>
-    <w:p>
-      <w:r>
-        <w:t>            echo '</w:t>
-      </w:r>
-      <w:r>
-        <w:rPr>
-          <w:rFonts w:ascii="Segoe UI Emoji" w:hAnsi="Segoe UI Emoji" w:cs="Segoe UI Emoji"/>
-        </w:rPr>
-        <w:t>❌</w:t>
-      </w:r>
-      <w:r>
-        <w:t xml:space="preserve"> Pipeline failed. Check logs for errors.'</w:t>
-      </w:r>
-    </w:p>
-    <w:p>
-      <w:r>
-        <w:t>        }</w:t>
-      </w:r>
-    </w:p>
-    <w:p>
-      <w:r>
-        <w:t>    }</w:t>
-      </w:r>
-    </w:p>
-    <w:p>
-      <w:r>
-        <w:t>}</w:t>
-      </w:r>
-    </w:p>
-    <w:p>
-      <w:r>
-        <w:br/>
-      </w:r>
-    </w:p>
-    <w:p>
-      <w:r>
-        <w:t>—-------------------------------------------------------------------------------------------—------------------</w:t>
-      </w:r>
-    </w:p>
-    <w:p>
-      <w:pPr>
-        <w:rPr>
-          <w:b/>
-          <w:bCs/>
-        </w:rPr>
-      </w:pPr>
-      <w:r>
-        <w:rPr>
-          <w:b/>
-          <w:bCs/>
-        </w:rPr>
-        <w:t>DevOps Capstone Project – Trading Game</w:t>
-      </w:r>
-    </w:p>
-    <w:p>
-      <w:pPr>
-        <w:rPr>
-          <w:b/>
-          <w:bCs/>
-        </w:rPr>
-      </w:pPr>
-      <w:r>
-        <w:rPr>
-          <w:b/>
-          <w:bCs/>
-        </w:rPr>
-        <w:t>Sprint 3: Configuration Management using Ansible</w:t>
-      </w:r>
-    </w:p>
-    <w:p>
-      <w:r>
-        <w:pict w14:anchorId="52799239">
-          <v:rect id="_x0000_i1627" style="width:0;height:1.5pt" o:hralign="center" o:hrstd="t" o:hr="t" fillcolor="#a0a0a0" stroked="f"/>
-        </w:pict>
-      </w:r>
-    </w:p>
-    <w:p>
-      <w:pPr>
-        <w:rPr>
-          <w:b/>
-          <w:bCs/>
-        </w:rPr>
-      </w:pPr>
-      <w:r>
-        <w:rPr>
-          <w:b/>
-          <w:bCs/>
-        </w:rPr>
-        <w:lastRenderedPageBreak/>
-        <w:t> Objective</w:t>
-      </w:r>
-    </w:p>
-    <w:p>
-      <w:r>
-        <w:t xml:space="preserve">The objective of Sprint 3 is to automate server configuration using Ansible and ensure consistent setup of EC2 instances. This includes installing required tools like Docker and </w:t>
-      </w:r>
-      <w:proofErr w:type="spellStart"/>
-      <w:r>
-        <w:t>kubectl</w:t>
-      </w:r>
-      <w:proofErr w:type="spellEnd"/>
-      <w:r>
-        <w:t>, and integrating the process with Jenkins.</w:t>
-      </w:r>
-    </w:p>
-    <w:p>
-      <w:r>
-        <w:pict w14:anchorId="1CEB83D4">
-          <v:rect id="_x0000_i1628" style="width:0;height:1.5pt" o:hralign="center" o:hrstd="t" o:hr="t" fillcolor="#a0a0a0" stroked="f"/>
-        </w:pict>
-      </w:r>
-    </w:p>
-    <w:p>
-      <w:pPr>
-        <w:rPr>
-          <w:b/>
-          <w:bCs/>
-        </w:rPr>
-      </w:pPr>
-      <w:r>
-        <w:rPr>
-          <w:b/>
-          <w:bCs/>
-        </w:rPr>
-        <w:t> Architecture Overview</w:t>
-      </w:r>
-    </w:p>
-    <w:p>
-      <w:r>
-        <w:t xml:space="preserve">Local Machine (Ansible) → SSH → AWS EC2 → Configuration (Docker, </w:t>
-      </w:r>
-      <w:proofErr w:type="spellStart"/>
-      <w:r>
-        <w:t>kubectl</w:t>
-      </w:r>
-      <w:proofErr w:type="spellEnd"/>
-      <w:r>
-        <w:t>)</w:t>
-      </w:r>
-    </w:p>
-    <w:p/>
-    <w:p>
-      <w:r>
         <w:pict w14:anchorId="122D1DCE">
-          <v:rect id="_x0000_i1629" style="width:0;height:1.5pt" o:hralign="center" o:hrstd="t" o:hr="t" fillcolor="#a0a0a0" stroked="f"/>
+          <v:rect id="_x0000_i1068" style="width:0;height:1.5pt" o:hralign="center" o:hrstd="t" o:hr="t" fillcolor="#a0a0a0" stroked="f"/>
         </w:pict>
       </w:r>
     </w:p>
@@ -4390,7 +3921,7 @@
     <w:p>
       <w:r>
         <w:pict w14:anchorId="67DD2DBE">
-          <v:rect id="_x0000_i1630" style="width:0;height:1.5pt" o:hralign="center" o:hrstd="t" o:hr="t" fillcolor="#a0a0a0" stroked="f"/>
+          <v:rect id="_x0000_i1069" style="width:0;height:1.5pt" o:hralign="center" o:hrstd="t" o:hr="t" fillcolor="#a0a0a0" stroked="f"/>
         </w:pict>
       </w:r>
     </w:p>
@@ -4417,6 +3948,7 @@
         </w:numPr>
       </w:pPr>
       <w:r>
+        <w:lastRenderedPageBreak/>
         <w:t>Ansible – Configuration management</w:t>
       </w:r>
     </w:p>
@@ -4445,7 +3977,7 @@
     <w:p>
       <w:r>
         <w:pict w14:anchorId="2B30BDEC">
-          <v:rect id="_x0000_i1631" style="width:0;height:1.5pt" o:hralign="center" o:hrstd="t" o:hr="t" fillcolor="#a0a0a0" stroked="f"/>
+          <v:rect id="_x0000_i1070" style="width:0;height:1.5pt" o:hralign="center" o:hrstd="t" o:hr="t" fillcolor="#a0a0a0" stroked="f"/>
         </w:pict>
       </w:r>
     </w:p>
@@ -4481,21 +4013,14 @@
     </w:p>
     <w:p>
       <w:r>
-        <w:t>    </w:t>
-      </w:r>
-      <w:proofErr w:type="spellStart"/>
-      <w:proofErr w:type="gramStart"/>
-      <w:r>
-        <w:t>setup.yaml</w:t>
-      </w:r>
-      <w:proofErr w:type="spellEnd"/>
-      <w:proofErr w:type="gramEnd"/>
+        <w:t>    setup.yaml</w:t>
+      </w:r>
     </w:p>
     <w:p/>
     <w:p>
       <w:r>
         <w:pict w14:anchorId="07F2CFCB">
-          <v:rect id="_x0000_i1632" style="width:0;height:1.5pt" o:hralign="center" o:hrstd="t" o:hr="t" fillcolor="#a0a0a0" stroked="f"/>
+          <v:rect id="_x0000_i1071" style="width:0;height:1.5pt" o:hralign="center" o:hrstd="t" o:hr="t" fillcolor="#a0a0a0" stroked="f"/>
         </w:pict>
       </w:r>
     </w:p>
@@ -4556,7 +4081,6 @@
         </w:numPr>
       </w:pPr>
       <w:r>
-        <w:lastRenderedPageBreak/>
         <w:t>Configured Security Group:</w:t>
       </w:r>
     </w:p>
@@ -4574,7 +4098,7 @@
     <w:p>
       <w:r>
         <w:pict w14:anchorId="091A560C">
-          <v:rect id="_x0000_i1633" style="width:0;height:1.5pt" o:hralign="center" o:hrstd="t" o:hr="t" fillcolor="#a0a0a0" stroked="f"/>
+          <v:rect id="_x0000_i1072" style="width:0;height:1.5pt" o:hralign="center" o:hrstd="t" o:hr="t" fillcolor="#a0a0a0" stroked="f"/>
         </w:pict>
       </w:r>
     </w:p>
@@ -4608,15 +4132,7 @@
     </w:p>
     <w:p>
       <w:r>
-        <w:t xml:space="preserve">brew </w:t>
-      </w:r>
-      <w:proofErr w:type="gramStart"/>
-      <w:r>
-        <w:t>install</w:t>
-      </w:r>
-      <w:proofErr w:type="gramEnd"/>
-      <w:r>
-        <w:t xml:space="preserve"> ansible</w:t>
+        <w:t>brew install ansible</w:t>
       </w:r>
     </w:p>
     <w:p/>
@@ -4634,7 +4150,7 @@
     <w:p>
       <w:r>
         <w:pict w14:anchorId="5263BFC8">
-          <v:rect id="_x0000_i1634" style="width:0;height:1.5pt" o:hralign="center" o:hrstd="t" o:hr="t" fillcolor="#a0a0a0" stroked="f"/>
+          <v:rect id="_x0000_i1073" style="width:0;height:1.5pt" o:hralign="center" o:hrstd="t" o:hr="t" fillcolor="#a0a0a0" stroked="f"/>
         </w:pict>
       </w:r>
     </w:p>
@@ -4673,38 +4189,15 @@
     </w:p>
     <w:p>
       <w:r>
-        <w:t xml:space="preserve">ec2-instance </w:t>
-      </w:r>
-      <w:proofErr w:type="spellStart"/>
-      <w:r>
-        <w:t>ansible_host</w:t>
-      </w:r>
-      <w:proofErr w:type="spellEnd"/>
-      <w:r>
-        <w:t xml:space="preserve">=16.60.114.188 </w:t>
-      </w:r>
-      <w:proofErr w:type="spellStart"/>
-      <w:r>
-        <w:t>ansible_user</w:t>
-      </w:r>
-      <w:proofErr w:type="spellEnd"/>
-      <w:r>
-        <w:t xml:space="preserve">=ubuntu </w:t>
-      </w:r>
-      <w:proofErr w:type="spellStart"/>
-      <w:r>
-        <w:t>ansible_ssh_private_key_file</w:t>
-      </w:r>
-      <w:proofErr w:type="spellEnd"/>
-      <w:r>
-        <w:t>=&lt;path-to-key&gt;</w:t>
+        <w:lastRenderedPageBreak/>
+        <w:t>ec2-instance ansible_host=16.60.114.188 ansible_user=ubuntu ansible_ssh_private_key_file=&lt;path-to-key&gt;</w:t>
       </w:r>
     </w:p>
     <w:p/>
     <w:p>
       <w:r>
         <w:pict w14:anchorId="57C1490D">
-          <v:rect id="_x0000_i1635" style="width:0;height:1.5pt" o:hralign="center" o:hrstd="t" o:hr="t" fillcolor="#a0a0a0" stroked="f"/>
+          <v:rect id="_x0000_i1074" style="width:0;height:1.5pt" o:hralign="center" o:hrstd="t" o:hr="t" fillcolor="#a0a0a0" stroked="f"/>
         </w:pict>
       </w:r>
     </w:p>
@@ -4733,15 +4226,7 @@
     </w:p>
     <w:p>
       <w:r>
-        <w:t>ansible -</w:t>
-      </w:r>
-      <w:proofErr w:type="spellStart"/>
-      <w:r>
-        <w:t>i</w:t>
-      </w:r>
-      <w:proofErr w:type="spellEnd"/>
-      <w:r>
-        <w:t xml:space="preserve"> inventory.ini all -m ping</w:t>
+        <w:t>ansible -i inventory.ini all -m ping</w:t>
       </w:r>
     </w:p>
     <w:p/>
@@ -4765,7 +4250,7 @@
     <w:p>
       <w:r>
         <w:pict w14:anchorId="2D1C590E">
-          <v:rect id="_x0000_i1636" style="width:0;height:1.5pt" o:hralign="center" o:hrstd="t" o:hr="t" fillcolor="#a0a0a0" stroked="f"/>
+          <v:rect id="_x0000_i1075" style="width:0;height:1.5pt" o:hralign="center" o:hrstd="t" o:hr="t" fillcolor="#a0a0a0" stroked="f"/>
         </w:pict>
       </w:r>
     </w:p>
@@ -4794,17 +4279,7 @@
     </w:p>
     <w:p>
       <w:r>
-        <w:t xml:space="preserve">Created </w:t>
-      </w:r>
-      <w:proofErr w:type="spellStart"/>
-      <w:proofErr w:type="gramStart"/>
-      <w:r>
-        <w:t>setup.yaml</w:t>
-      </w:r>
-      <w:proofErr w:type="spellEnd"/>
-      <w:proofErr w:type="gramEnd"/>
-      <w:r>
-        <w:t xml:space="preserve"> to configure EC2:</w:t>
+        <w:t>Created setup.yaml to configure EC2:</w:t>
       </w:r>
     </w:p>
     <w:p>
@@ -4826,7 +4301,6 @@
         </w:numPr>
       </w:pPr>
       <w:r>
-        <w:lastRenderedPageBreak/>
         <w:t>Install Docker</w:t>
       </w:r>
     </w:p>
@@ -4849,13 +4323,8 @@
         </w:numPr>
       </w:pPr>
       <w:r>
-        <w:t xml:space="preserve">Install </w:t>
-      </w:r>
-      <w:proofErr w:type="spellStart"/>
-      <w:r>
-        <w:t>kubectl</w:t>
-      </w:r>
-      <w:proofErr w:type="spellEnd"/>
+        <w:t>Install kubectl</w:t>
+      </w:r>
     </w:p>
     <w:p>
       <w:pPr>
@@ -4871,7 +4340,7 @@
     <w:p>
       <w:r>
         <w:pict w14:anchorId="3391460E">
-          <v:rect id="_x0000_i1637" style="width:0;height:1.5pt" o:hralign="center" o:hrstd="t" o:hr="t" fillcolor="#a0a0a0" stroked="f"/>
+          <v:rect id="_x0000_i1076" style="width:0;height:1.5pt" o:hralign="center" o:hrstd="t" o:hr="t" fillcolor="#a0a0a0" stroked="f"/>
         </w:pict>
       </w:r>
     </w:p>
@@ -4900,29 +4369,14 @@
     </w:p>
     <w:p>
       <w:r>
-        <w:t>ansible-playbook -</w:t>
-      </w:r>
-      <w:proofErr w:type="spellStart"/>
-      <w:r>
-        <w:t>i</w:t>
-      </w:r>
-      <w:proofErr w:type="spellEnd"/>
-      <w:r>
-        <w:t xml:space="preserve"> inventory.ini </w:t>
-      </w:r>
-      <w:proofErr w:type="spellStart"/>
-      <w:proofErr w:type="gramStart"/>
-      <w:r>
-        <w:t>setup.yaml</w:t>
-      </w:r>
-      <w:proofErr w:type="spellEnd"/>
-      <w:proofErr w:type="gramEnd"/>
+        <w:t>ansible-playbook -i inventory.ini setup.yaml</w:t>
+      </w:r>
     </w:p>
     <w:p/>
     <w:p>
       <w:r>
         <w:pict w14:anchorId="67394400">
-          <v:rect id="_x0000_i1638" style="width:0;height:1.5pt" o:hralign="center" o:hrstd="t" o:hr="t" fillcolor="#a0a0a0" stroked="f"/>
+          <v:rect id="_x0000_i1077" style="width:0;height:1.5pt" o:hralign="center" o:hrstd="t" o:hr="t" fillcolor="#a0a0a0" stroked="f"/>
         </w:pict>
       </w:r>
     </w:p>
@@ -4956,31 +4410,7 @@
     </w:p>
     <w:p>
       <w:r>
-        <w:t> ssh -</w:t>
-      </w:r>
-      <w:proofErr w:type="spellStart"/>
-      <w:r>
-        <w:t>i</w:t>
-      </w:r>
-      <w:proofErr w:type="spellEnd"/>
-      <w:r>
-        <w:t xml:space="preserve"> /Users/</w:t>
-      </w:r>
-      <w:proofErr w:type="spellStart"/>
-      <w:r>
-        <w:t>ishanrevri</w:t>
-      </w:r>
-      <w:proofErr w:type="spellEnd"/>
-      <w:r>
-        <w:t>/Downloads/</w:t>
-      </w:r>
-      <w:proofErr w:type="spellStart"/>
-      <w:r>
-        <w:t>priyanka_key.pem</w:t>
-      </w:r>
-      <w:proofErr w:type="spellEnd"/>
-      <w:r>
-        <w:t xml:space="preserve"> ubuntu@16.60.114.188 </w:t>
+        <w:t> ssh -i /Users/ishanrevri/Downloads/priyanka_key.pem ubuntu@16.60.114.188 </w:t>
       </w:r>
     </w:p>
     <w:p/>
@@ -4991,17 +4421,13 @@
     </w:p>
     <w:p>
       <w:r>
+        <w:lastRenderedPageBreak/>
         <w:t>docker --version</w:t>
       </w:r>
     </w:p>
     <w:p>
-      <w:proofErr w:type="spellStart"/>
-      <w:r>
-        <w:t>kubectl</w:t>
-      </w:r>
-      <w:proofErr w:type="spellEnd"/>
-      <w:r>
-        <w:t xml:space="preserve"> version --client</w:t>
+      <w:r>
+        <w:t>kubectl version --client</w:t>
       </w:r>
     </w:p>
     <w:p/>
@@ -5019,7 +4445,7 @@
     <w:p>
       <w:r>
         <w:pict w14:anchorId="1AF2A7B1">
-          <v:rect id="_x0000_i1639" style="width:0;height:1.5pt" o:hralign="center" o:hrstd="t" o:hr="t" fillcolor="#a0a0a0" stroked="f"/>
+          <v:rect id="_x0000_i1078" style="width:0;height:1.5pt" o:hralign="center" o:hrstd="t" o:hr="t" fillcolor="#a0a0a0" stroked="f"/>
         </w:pict>
       </w:r>
     </w:p>
@@ -5059,13 +4485,8 @@
       </w:r>
     </w:p>
     <w:p>
-      <w:proofErr w:type="gramStart"/>
-      <w:r>
-        <w:t>stage(</w:t>
-      </w:r>
-      <w:proofErr w:type="gramEnd"/>
-      <w:r>
-        <w:t>'Validate Ansible') {</w:t>
+      <w:r>
+        <w:t>stage('Validate Ansible') {</w:t>
       </w:r>
     </w:p>
     <w:p>
@@ -5075,28 +4496,12 @@
     </w:p>
     <w:p>
       <w:r>
-        <w:t>        </w:t>
-      </w:r>
-      <w:proofErr w:type="spellStart"/>
-      <w:r>
-        <w:t>dir</w:t>
-      </w:r>
-      <w:proofErr w:type="spellEnd"/>
-      <w:r>
-        <w:t>('ansible') {</w:t>
-      </w:r>
-    </w:p>
-    <w:p>
-      <w:r>
-        <w:t>            </w:t>
-      </w:r>
-      <w:proofErr w:type="spellStart"/>
-      <w:r>
-        <w:t>sh</w:t>
-      </w:r>
-      <w:proofErr w:type="spellEnd"/>
-      <w:r>
-        <w:t xml:space="preserve"> 'ls -l'</w:t>
+        <w:t>        dir('ansible') {</w:t>
+      </w:r>
+    </w:p>
+    <w:p>
+      <w:r>
+        <w:t>            sh 'ls -l'</w:t>
       </w:r>
     </w:p>
     <w:p>
@@ -5111,20 +4516,183 @@
     </w:p>
     <w:p>
       <w:r>
+        <w:t>}</w:t>
+      </w:r>
+    </w:p>
+    <w:p/>
+    <w:p>
+      <w:r>
+        <w:t>(Optional: Run playbook if environment supports Ansible)</w:t>
+      </w:r>
+    </w:p>
+    <w:p>
+      <w:r>
+        <w:pict w14:anchorId="6A17F628">
+          <v:rect id="_x0000_i1079" style="width:0;height:1.5pt" o:hralign="center" o:hrstd="t" o:hr="t" fillcolor="#a0a0a0" stroked="f"/>
+        </w:pict>
+      </w:r>
+    </w:p>
+    <w:p>
+      <w:pPr>
+        <w:rPr>
+          <w:b/>
+          <w:bCs/>
+        </w:rPr>
+      </w:pPr>
+      <w:r>
+        <w:rPr>
+          <w:b/>
+          <w:bCs/>
+        </w:rPr>
+        <w:t> Challenges Faced &amp; Solutions</w:t>
+      </w:r>
+    </w:p>
+    <w:p>
+      <w:r>
+        <w:pict w14:anchorId="344B59F6">
+          <v:rect id="_x0000_i1080" style="width:0;height:1.5pt" o:hralign="center" o:hrstd="t" o:hr="t" fillcolor="#a0a0a0" stroked="f"/>
+        </w:pict>
+      </w:r>
+    </w:p>
+    <w:p>
+      <w:pPr>
+        <w:rPr>
+          <w:b/>
+          <w:bCs/>
+        </w:rPr>
+      </w:pPr>
+      <w:r>
+        <w:rPr>
+          <w:b/>
+          <w:bCs/>
+        </w:rPr>
+        <w:t> Issue 1: Inventory File Not Parsed</w:t>
+      </w:r>
+    </w:p>
+    <w:p>
+      <w:r>
+        <w:rPr>
+          <w:b/>
+          <w:bCs/>
+        </w:rPr>
+        <w:t>Cause:</w:t>
+      </w:r>
+      <w:r>
+        <w:t xml:space="preserve"> Incorrect file naming</w:t>
+      </w:r>
+      <w:r>
+        <w:br/>
+      </w:r>
+      <w:r>
+        <w:rPr>
+          <w:b/>
+          <w:bCs/>
+        </w:rPr>
+        <w:t>Fix:</w:t>
+      </w:r>
+      <w:r>
+        <w:t xml:space="preserve"> Corrected file format and naming</w:t>
+      </w:r>
+    </w:p>
+    <w:p>
+      <w:r>
+        <w:pict w14:anchorId="49C70EC1">
+          <v:rect id="_x0000_i1081" style="width:0;height:1.5pt" o:hralign="center" o:hrstd="t" o:hr="t" fillcolor="#a0a0a0" stroked="f"/>
+        </w:pict>
+      </w:r>
+    </w:p>
+    <w:p>
+      <w:pPr>
+        <w:rPr>
+          <w:b/>
+          <w:bCs/>
+        </w:rPr>
+      </w:pPr>
+      <w:r>
+        <w:rPr>
+          <w:b/>
+          <w:bCs/>
+        </w:rPr>
+        <w:t> Issue 2: Host Key Verification Failed</w:t>
+      </w:r>
+    </w:p>
+    <w:p>
+      <w:r>
+        <w:rPr>
+          <w:b/>
+          <w:bCs/>
+        </w:rPr>
+        <w:t>Cause:</w:t>
+      </w:r>
+      <w:r>
+        <w:t xml:space="preserve"> SSH trust not established</w:t>
+      </w:r>
+      <w:r>
+        <w:br/>
+      </w:r>
+      <w:r>
+        <w:rPr>
+          <w:b/>
+          <w:bCs/>
+        </w:rPr>
+        <w:t>Fix:</w:t>
+      </w:r>
+      <w:r>
+        <w:t xml:space="preserve"> Connected manually using SSH and accepted host</w:t>
+      </w:r>
+    </w:p>
+    <w:p>
+      <w:r>
+        <w:pict w14:anchorId="748DDA87">
+          <v:rect id="_x0000_i1082" style="width:0;height:1.5pt" o:hralign="center" o:hrstd="t" o:hr="t" fillcolor="#a0a0a0" stroked="f"/>
+        </w:pict>
+      </w:r>
+    </w:p>
+    <w:p>
+      <w:pPr>
+        <w:rPr>
+          <w:b/>
+          <w:bCs/>
+        </w:rPr>
+      </w:pPr>
+      <w:r>
+        <w:rPr>
+          <w:b/>
+          <w:bCs/>
+        </w:rPr>
         <w:lastRenderedPageBreak/>
-        <w:t>}</w:t>
-      </w:r>
-    </w:p>
-    <w:p/>
-    <w:p>
-      <w:r>
-        <w:t>(Optional: Run playbook if environment supports Ansible)</w:t>
-      </w:r>
-    </w:p>
-    <w:p>
-      <w:r>
-        <w:pict w14:anchorId="6A17F628">
-          <v:rect id="_x0000_i1640" style="width:0;height:1.5pt" o:hralign="center" o:hrstd="t" o:hr="t" fillcolor="#a0a0a0" stroked="f"/>
+        <w:t> Issue 3: Private vs Public IP</w:t>
+      </w:r>
+    </w:p>
+    <w:p>
+      <w:r>
+        <w:rPr>
+          <w:b/>
+          <w:bCs/>
+        </w:rPr>
+        <w:t>Cause:</w:t>
+      </w:r>
+      <w:r>
+        <w:t xml:space="preserve"> Used private IP initially</w:t>
+      </w:r>
+      <w:r>
+        <w:br/>
+      </w:r>
+      <w:r>
+        <w:rPr>
+          <w:b/>
+          <w:bCs/>
+        </w:rPr>
+        <w:t>Fix:</w:t>
+      </w:r>
+      <w:r>
+        <w:t xml:space="preserve"> Switched to public IP</w:t>
+      </w:r>
+    </w:p>
+    <w:p>
+      <w:r>
+        <w:pict w14:anchorId="010553C6">
+          <v:rect id="_x0000_i1083" style="width:0;height:1.5pt" o:hralign="center" o:hrstd="t" o:hr="t" fillcolor="#a0a0a0" stroked="f"/>
         </w:pict>
       </w:r>
     </w:p>
@@ -5140,181 +4708,54 @@
           <w:b/>
           <w:bCs/>
         </w:rPr>
-        <w:t> Challenges Faced &amp; Solutions</w:t>
-      </w:r>
-    </w:p>
-    <w:p>
-      <w:r>
-        <w:pict w14:anchorId="344B59F6">
-          <v:rect id="_x0000_i1641" style="width:0;height:1.5pt" o:hralign="center" o:hrstd="t" o:hr="t" fillcolor="#a0a0a0" stroked="f"/>
-        </w:pict>
-      </w:r>
-    </w:p>
-    <w:p>
-      <w:pPr>
-        <w:rPr>
-          <w:b/>
-          <w:bCs/>
-        </w:rPr>
-      </w:pPr>
-      <w:r>
-        <w:rPr>
-          <w:b/>
-          <w:bCs/>
-        </w:rPr>
-        <w:t> Issue 1: Inventory File Not Parsed</w:t>
-      </w:r>
-    </w:p>
-    <w:p>
-      <w:r>
-        <w:rPr>
-          <w:b/>
-          <w:bCs/>
-        </w:rPr>
-        <w:t>Cause:</w:t>
-      </w:r>
-      <w:r>
-        <w:t xml:space="preserve"> Incorrect file naming</w:t>
+        <w:t> Outcome</w:t>
+      </w:r>
+    </w:p>
+    <w:p>
+      <w:r>
+        <w:rPr>
+          <w:rFonts w:ascii="Segoe UI Symbol" w:hAnsi="Segoe UI Symbol" w:cs="Segoe UI Symbol"/>
+        </w:rPr>
+        <w:t>✔</w:t>
+      </w:r>
+      <w:r>
+        <w:t xml:space="preserve"> Automated EC2 configuration</w:t>
       </w:r>
       <w:r>
         <w:br/>
       </w:r>
       <w:r>
         <w:rPr>
-          <w:b/>
-          <w:bCs/>
-        </w:rPr>
-        <w:t>Fix:</w:t>
-      </w:r>
-      <w:r>
-        <w:t xml:space="preserve"> Corrected file format and naming</w:t>
-      </w:r>
-    </w:p>
-    <w:p>
-      <w:r>
-        <w:pict w14:anchorId="49C70EC1">
-          <v:rect id="_x0000_i1642" style="width:0;height:1.5pt" o:hralign="center" o:hrstd="t" o:hr="t" fillcolor="#a0a0a0" stroked="f"/>
-        </w:pict>
-      </w:r>
-    </w:p>
-    <w:p>
-      <w:pPr>
-        <w:rPr>
-          <w:b/>
-          <w:bCs/>
-        </w:rPr>
-      </w:pPr>
-      <w:r>
-        <w:rPr>
-          <w:b/>
-          <w:bCs/>
-        </w:rPr>
-        <w:t> Issue 2: Host Key Verification Failed</w:t>
-      </w:r>
-    </w:p>
-    <w:p>
-      <w:r>
-        <w:rPr>
-          <w:b/>
-          <w:bCs/>
-        </w:rPr>
-        <w:t>Cause:</w:t>
-      </w:r>
-      <w:r>
-        <w:t xml:space="preserve"> SSH trust not established</w:t>
+          <w:rFonts w:ascii="Segoe UI Symbol" w:hAnsi="Segoe UI Symbol" w:cs="Segoe UI Symbol"/>
+        </w:rPr>
+        <w:t>✔</w:t>
+      </w:r>
+      <w:r>
+        <w:t xml:space="preserve"> Docker installed via Ansible</w:t>
       </w:r>
       <w:r>
         <w:br/>
       </w:r>
       <w:r>
         <w:rPr>
-          <w:b/>
-          <w:bCs/>
-        </w:rPr>
-        <w:t>Fix:</w:t>
-      </w:r>
-      <w:r>
-        <w:t xml:space="preserve"> Connected manually using SSH and accepted host</w:t>
-      </w:r>
-    </w:p>
-    <w:p>
-      <w:r>
-        <w:pict w14:anchorId="748DDA87">
-          <v:rect id="_x0000_i1643" style="width:0;height:1.5pt" o:hralign="center" o:hrstd="t" o:hr="t" fillcolor="#a0a0a0" stroked="f"/>
-        </w:pict>
-      </w:r>
-    </w:p>
-    <w:p>
-      <w:pPr>
-        <w:rPr>
-          <w:b/>
-          <w:bCs/>
-        </w:rPr>
-      </w:pPr>
-      <w:r>
-        <w:rPr>
-          <w:b/>
-          <w:bCs/>
-        </w:rPr>
-        <w:t> Issue 3: Private vs Public IP</w:t>
-      </w:r>
-    </w:p>
-    <w:p>
-      <w:r>
-        <w:rPr>
-          <w:b/>
-          <w:bCs/>
-        </w:rPr>
-        <w:t>Cause:</w:t>
-      </w:r>
-      <w:r>
-        <w:t xml:space="preserve"> Used private IP initially</w:t>
+          <w:rFonts w:ascii="Segoe UI Symbol" w:hAnsi="Segoe UI Symbol" w:cs="Segoe UI Symbol"/>
+        </w:rPr>
+        <w:t>✔</w:t>
+      </w:r>
+      <w:r>
+        <w:t xml:space="preserve"> kubectl installed via Ansible</w:t>
       </w:r>
       <w:r>
         <w:br/>
       </w:r>
       <w:r>
         <w:rPr>
-          <w:b/>
-          <w:bCs/>
-        </w:rPr>
-        <w:t>Fix:</w:t>
-      </w:r>
-      <w:r>
-        <w:t xml:space="preserve"> Switched to public IP</w:t>
-      </w:r>
-    </w:p>
-    <w:p>
-      <w:r>
-        <w:pict w14:anchorId="010553C6">
-          <v:rect id="_x0000_i1644" style="width:0;height:1.5pt" o:hralign="center" o:hrstd="t" o:hr="t" fillcolor="#a0a0a0" stroked="f"/>
-        </w:pict>
-      </w:r>
-    </w:p>
-    <w:p>
-      <w:pPr>
-        <w:rPr>
-          <w:b/>
-          <w:bCs/>
-        </w:rPr>
-      </w:pPr>
-      <w:r>
-        <w:rPr>
-          <w:b/>
-          <w:bCs/>
-        </w:rPr>
-        <w:t> Outcome</w:t>
-      </w:r>
-    </w:p>
-    <w:p>
-      <w:r>
-        <w:rPr>
           <w:rFonts w:ascii="Segoe UI Symbol" w:hAnsi="Segoe UI Symbol" w:cs="Segoe UI Symbol"/>
         </w:rPr>
         <w:t>✔</w:t>
       </w:r>
       <w:r>
-        <w:t xml:space="preserve"> Automated EC2 configuration</w:t>
+        <w:t xml:space="preserve"> Verified setup using SSH</w:t>
       </w:r>
       <w:r>
         <w:br/>
@@ -5326,57 +4767,13 @@
         <w:t>✔</w:t>
       </w:r>
       <w:r>
-        <w:t xml:space="preserve"> Docker installed via Ansible</w:t>
-      </w:r>
-      <w:r>
-        <w:br/>
-      </w:r>
-      <w:r>
-        <w:rPr>
-          <w:rFonts w:ascii="Segoe UI Symbol" w:hAnsi="Segoe UI Symbol" w:cs="Segoe UI Symbol"/>
-        </w:rPr>
-        <w:t>✔</w:t>
-      </w:r>
-      <w:r>
-        <w:t xml:space="preserve"> </w:t>
-      </w:r>
-      <w:proofErr w:type="spellStart"/>
-      <w:r>
-        <w:t>kubectl</w:t>
-      </w:r>
-      <w:proofErr w:type="spellEnd"/>
-      <w:r>
-        <w:t xml:space="preserve"> installed via Ansible</w:t>
-      </w:r>
-      <w:r>
-        <w:br/>
-      </w:r>
-      <w:r>
-        <w:rPr>
-          <w:rFonts w:ascii="Segoe UI Symbol" w:hAnsi="Segoe UI Symbol" w:cs="Segoe UI Symbol"/>
-        </w:rPr>
-        <w:t>✔</w:t>
-      </w:r>
-      <w:r>
-        <w:t xml:space="preserve"> Verified setup using SSH</w:t>
-      </w:r>
-      <w:r>
-        <w:br/>
-      </w:r>
-      <w:r>
-        <w:rPr>
-          <w:rFonts w:ascii="Segoe UI Symbol" w:hAnsi="Segoe UI Symbol" w:cs="Segoe UI Symbol"/>
-        </w:rPr>
-        <w:t>✔</w:t>
-      </w:r>
-      <w:r>
         <w:t xml:space="preserve"> Integrated Ansible with Jenkins (basic level)</w:t>
       </w:r>
     </w:p>
     <w:p>
       <w:r>
         <w:pict w14:anchorId="446B879B">
-          <v:rect id="_x0000_i1645" style="width:0;height:1.5pt" o:hralign="center" o:hrstd="t" o:hr="t" fillcolor="#a0a0a0" stroked="f"/>
+          <v:rect id="_x0000_i1084" style="width:0;height:1.5pt" o:hralign="center" o:hrstd="t" o:hr="t" fillcolor="#a0a0a0" stroked="f"/>
         </w:pict>
       </w:r>
     </w:p>
@@ -5447,14 +4844,13 @@
         </w:numPr>
       </w:pPr>
       <w:r>
-        <w:lastRenderedPageBreak/>
         <w:t>Integration of configuration management into CI workflow</w:t>
       </w:r>
     </w:p>
     <w:p>
       <w:r>
         <w:pict w14:anchorId="6C3E1362">
-          <v:rect id="_x0000_i1646" style="width:0;height:1.5pt" o:hralign="center" o:hrstd="t" o:hr="t" fillcolor="#a0a0a0" stroked="f"/>
+          <v:rect id="_x0000_i1085" style="width:0;height:1.5pt" o:hralign="center" o:hrstd="t" o:hr="t" fillcolor="#a0a0a0" stroked="f"/>
         </w:pict>
       </w:r>
     </w:p>
@@ -5512,6 +4908,7 @@
           <w:b/>
           <w:bCs/>
         </w:rPr>
+        <w:lastRenderedPageBreak/>
         <w:t>Playbook execution output:</w:t>
       </w:r>
     </w:p>
@@ -5528,21 +4925,12 @@
     <w:p/>
     <w:p/>
     <w:p>
-      <w:proofErr w:type="spellStart"/>
-      <w:r>
-        <w:rPr>
-          <w:b/>
-          <w:bCs/>
-        </w:rPr>
-        <w:t>Kubectl</w:t>
-      </w:r>
-      <w:proofErr w:type="spellEnd"/>
-      <w:r>
-        <w:rPr>
-          <w:b/>
-          <w:bCs/>
-        </w:rPr>
-        <w:t xml:space="preserve"> installed version:</w:t>
+      <w:r>
+        <w:rPr>
+          <w:b/>
+          <w:bCs/>
+        </w:rPr>
+        <w:t>Kubectl installed version:</w:t>
       </w:r>
     </w:p>
     <w:p>
@@ -5583,34 +4971,100 @@
     <w:p/>
     <w:p>
       <w:r>
-        <w:t>        </w:t>
-      </w:r>
-      <w:proofErr w:type="gramStart"/>
-      <w:r>
-        <w:t>stage(</w:t>
-      </w:r>
-      <w:proofErr w:type="gramEnd"/>
-      <w:r>
-        <w:t>'Clone Repo') {</w:t>
+        <w:t>        stage('Clone Repo') {</w:t>
+      </w:r>
+    </w:p>
+    <w:p>
+      <w:r>
+        <w:t>            steps {</w:t>
+      </w:r>
+    </w:p>
+    <w:p>
+      <w:r>
+        <w:t>                git branch: 'sprint3', url: 'https://github.com/Priyanka-1920/Capstone-TradingGame.git'</w:t>
+      </w:r>
+    </w:p>
+    <w:p>
+      <w:r>
+        <w:t>            }</w:t>
+      </w:r>
+    </w:p>
+    <w:p>
+      <w:r>
+        <w:t>        }</w:t>
+      </w:r>
+    </w:p>
+    <w:p/>
+    <w:p>
+      <w:r>
+        <w:t>        stage('Validate Ansible Files') {</w:t>
+      </w:r>
+    </w:p>
+    <w:p>
+      <w:r>
+        <w:t>            steps {</w:t>
+      </w:r>
+    </w:p>
+    <w:p>
+      <w:r>
+        <w:t>                dir('ansible') {</w:t>
+      </w:r>
+    </w:p>
+    <w:p>
+      <w:r>
+        <w:t>                    sh '''</w:t>
+      </w:r>
+    </w:p>
+    <w:p>
+      <w:r>
+        <w:t>                    echo "Checking Ansible files..."</w:t>
+      </w:r>
+    </w:p>
+    <w:p>
+      <w:r>
+        <w:t>                    ls -l</w:t>
+      </w:r>
+    </w:p>
+    <w:p>
+      <w:r>
+        <w:t>                    cat inventory.ini</w:t>
       </w:r>
     </w:p>
     <w:p>
       <w:r>
         <w:lastRenderedPageBreak/>
+        <w:t>                    '''</w:t>
+      </w:r>
+    </w:p>
+    <w:p>
+      <w:r>
+        <w:t>                }</w:t>
+      </w:r>
+    </w:p>
+    <w:p>
+      <w:r>
+        <w:t>            }</w:t>
+      </w:r>
+    </w:p>
+    <w:p>
+      <w:r>
+        <w:t>        }</w:t>
+      </w:r>
+    </w:p>
+    <w:p/>
+    <w:p>
+      <w:r>
+        <w:t>        stage('Basic Syntax Check') {</w:t>
+      </w:r>
+    </w:p>
+    <w:p>
+      <w:r>
         <w:t>            steps {</w:t>
       </w:r>
     </w:p>
     <w:p>
       <w:r>
-        <w:t>                git branch: 'sprint3', url: 'https://github.com/Priyanka-1920/Capstone-</w:t>
-      </w:r>
-      <w:proofErr w:type="spellStart"/>
-      <w:r>
-        <w:t>TradingGame.git</w:t>
-      </w:r>
-      <w:proofErr w:type="spellEnd"/>
-      <w:r>
-        <w:t>'</w:t>
+        <w:t>                echo 'Ansible configuration validated successfully'</w:t>
       </w:r>
     </w:p>
     <w:p>
@@ -5626,76 +5080,23 @@
     <w:p/>
     <w:p>
       <w:r>
-        <w:t>        </w:t>
-      </w:r>
-      <w:proofErr w:type="gramStart"/>
-      <w:r>
-        <w:t>stage(</w:t>
-      </w:r>
-      <w:proofErr w:type="gramEnd"/>
-      <w:r>
-        <w:t>'Validate Ansible Files') {</w:t>
-      </w:r>
-    </w:p>
-    <w:p>
-      <w:r>
-        <w:t>            steps {</w:t>
-      </w:r>
-    </w:p>
-    <w:p>
-      <w:r>
-        <w:t>                </w:t>
-      </w:r>
-      <w:proofErr w:type="spellStart"/>
-      <w:r>
-        <w:t>dir</w:t>
-      </w:r>
-      <w:proofErr w:type="spellEnd"/>
-      <w:r>
-        <w:t>('ansible') {</w:t>
-      </w:r>
-    </w:p>
-    <w:p>
-      <w:r>
-        <w:t>                    </w:t>
-      </w:r>
-      <w:proofErr w:type="spellStart"/>
-      <w:r>
-        <w:t>sh</w:t>
-      </w:r>
-      <w:proofErr w:type="spellEnd"/>
-      <w:r>
-        <w:t xml:space="preserve"> '''</w:t>
-      </w:r>
-    </w:p>
-    <w:p>
-      <w:r>
-        <w:t>                    echo "Checking Ansible files..."</w:t>
-      </w:r>
-    </w:p>
-    <w:p>
-      <w:r>
-        <w:t>                    ls -l</w:t>
-      </w:r>
-    </w:p>
-    <w:p>
-      <w:r>
-        <w:t>                    cat inventory.ini</w:t>
-      </w:r>
-    </w:p>
-    <w:p>
-      <w:r>
-        <w:t>                    '''</w:t>
-      </w:r>
-    </w:p>
-    <w:p>
-      <w:r>
-        <w:t>                }</w:t>
-      </w:r>
-    </w:p>
-    <w:p>
-      <w:r>
-        <w:t>            }</w:t>
+        <w:t>    }</w:t>
+      </w:r>
+    </w:p>
+    <w:p/>
+    <w:p>
+      <w:r>
+        <w:t>    post {</w:t>
+      </w:r>
+    </w:p>
+    <w:p>
+      <w:r>
+        <w:t>        success {</w:t>
+      </w:r>
+    </w:p>
+    <w:p>
+      <w:r>
+        <w:t>            echo ' Sprint 3 CI Pipeline Successful!'</w:t>
       </w:r>
     </w:p>
     <w:p>
@@ -5703,209 +5104,139 @@
         <w:t>        }</w:t>
       </w:r>
     </w:p>
+    <w:p>
+      <w:r>
+        <w:t>        failure {</w:t>
+      </w:r>
+    </w:p>
+    <w:p>
+      <w:r>
+        <w:t>            echo ' Pipeline Failed!'</w:t>
+      </w:r>
+    </w:p>
+    <w:p>
+      <w:r>
+        <w:t>        }</w:t>
+      </w:r>
+    </w:p>
+    <w:p>
+      <w:r>
+        <w:t>    }</w:t>
+      </w:r>
+    </w:p>
+    <w:p>
+      <w:r>
+        <w:t>}</w:t>
+      </w:r>
+    </w:p>
     <w:p/>
     <w:p>
       <w:r>
-        <w:t>        </w:t>
-      </w:r>
-      <w:proofErr w:type="gramStart"/>
-      <w:r>
-        <w:t>stage(</w:t>
-      </w:r>
-      <w:proofErr w:type="gramEnd"/>
-      <w:r>
-        <w:t>'Basic Syntax Check') {</w:t>
-      </w:r>
-    </w:p>
-    <w:p>
-      <w:r>
-        <w:t>            steps {</w:t>
-      </w:r>
-    </w:p>
-    <w:p>
-      <w:r>
-        <w:t>                echo 'Ansible configuration validated successfully'</w:t>
-      </w:r>
-    </w:p>
-    <w:p>
-      <w:r>
-        <w:t>            }</w:t>
-      </w:r>
-    </w:p>
-    <w:p>
-      <w:r>
-        <w:t>        }</w:t>
+        <w:rPr>
+          <w:b/>
+          <w:bCs/>
+        </w:rPr>
+        <w:t>Github branch:</w:t>
       </w:r>
     </w:p>
     <w:p/>
     <w:p>
       <w:r>
-        <w:t>    }</w:t>
+        <w:pict w14:anchorId="247A863F">
+          <v:rect id="_x0000_i1086" style="width:0;height:1.5pt" o:hralign="center" o:hrstd="t" o:hr="t" fillcolor="#a0a0a0" stroked="f"/>
+        </w:pict>
+      </w:r>
+    </w:p>
+    <w:p>
+      <w:pPr>
+        <w:rPr>
+          <w:b/>
+          <w:bCs/>
+        </w:rPr>
+      </w:pPr>
+      <w:r>
+        <w:rPr>
+          <w:b/>
+          <w:bCs/>
+        </w:rPr>
+        <w:t>DevOps Capstone Project – Trading Game</w:t>
+      </w:r>
+    </w:p>
+    <w:p>
+      <w:pPr>
+        <w:rPr>
+          <w:b/>
+          <w:bCs/>
+        </w:rPr>
+      </w:pPr>
+      <w:r>
+        <w:rPr>
+          <w:b/>
+          <w:bCs/>
+        </w:rPr>
+        <w:t>Sprint 4: CI/CD Pipeline for Application Deployment on Kubernetes (EKS)</w:t>
+      </w:r>
+    </w:p>
+    <w:p>
+      <w:r>
+        <w:lastRenderedPageBreak/>
+        <w:pict w14:anchorId="0B7CEB3E">
+          <v:rect id="_x0000_i1087" style="width:0;height:1.5pt" o:hralign="center" o:hrstd="t" o:hr="t" fillcolor="#a0a0a0" stroked="f"/>
+        </w:pict>
+      </w:r>
+    </w:p>
+    <w:p>
+      <w:pPr>
+        <w:rPr>
+          <w:b/>
+          <w:bCs/>
+        </w:rPr>
+      </w:pPr>
+      <w:r>
+        <w:rPr>
+          <w:b/>
+          <w:bCs/>
+        </w:rPr>
+        <w:t> Objective</w:t>
+      </w:r>
+    </w:p>
+    <w:p>
+      <w:r>
+        <w:t>The objective of Sprint 4 is to implement a CI/CD pipeline using Jenkins that automates the process of building, pushing, and deploying the application to a Kubernetes cluster (Amazon EKS). The goal is to ensure seamless and automated deployment from code to production.</w:t>
+      </w:r>
+    </w:p>
+    <w:p>
+      <w:r>
+        <w:pict w14:anchorId="52596085">
+          <v:rect id="_x0000_i1088" style="width:0;height:1.5pt" o:hralign="center" o:hrstd="t" o:hr="t" fillcolor="#a0a0a0" stroked="f"/>
+        </w:pict>
+      </w:r>
+    </w:p>
+    <w:p>
+      <w:pPr>
+        <w:rPr>
+          <w:b/>
+          <w:bCs/>
+        </w:rPr>
+      </w:pPr>
+      <w:r>
+        <w:rPr>
+          <w:b/>
+          <w:bCs/>
+        </w:rPr>
+        <w:t> Architecture Overview</w:t>
+      </w:r>
+    </w:p>
+    <w:p>
+      <w:r>
+        <w:t>Developer → GitHub → Jenkins → (Build &amp; Push) → Kubernetes (EKS) → Application</w:t>
       </w:r>
     </w:p>
     <w:p/>
     <w:p>
       <w:r>
-        <w:t>    post {</w:t>
-      </w:r>
-    </w:p>
-    <w:p>
-      <w:r>
-        <w:t>        success {</w:t>
-      </w:r>
-    </w:p>
-    <w:p>
-      <w:r>
-        <w:lastRenderedPageBreak/>
-        <w:t>            echo ' Sprint 3 CI Pipeline Successful!'</w:t>
-      </w:r>
-    </w:p>
-    <w:p>
-      <w:r>
-        <w:t>        }</w:t>
-      </w:r>
-    </w:p>
-    <w:p>
-      <w:r>
-        <w:t>        failure {</w:t>
-      </w:r>
-    </w:p>
-    <w:p>
-      <w:r>
-        <w:t>            echo ' Pipeline Failed!'</w:t>
-      </w:r>
-    </w:p>
-    <w:p>
-      <w:r>
-        <w:t>        }</w:t>
-      </w:r>
-    </w:p>
-    <w:p>
-      <w:r>
-        <w:t>    }</w:t>
-      </w:r>
-    </w:p>
-    <w:p>
-      <w:r>
-        <w:t>}</w:t>
-      </w:r>
-    </w:p>
-    <w:p/>
-    <w:p>
-      <w:proofErr w:type="spellStart"/>
-      <w:r>
-        <w:rPr>
-          <w:b/>
-          <w:bCs/>
-        </w:rPr>
-        <w:t>Github</w:t>
-      </w:r>
-      <w:proofErr w:type="spellEnd"/>
-      <w:r>
-        <w:rPr>
-          <w:b/>
-          <w:bCs/>
-        </w:rPr>
-        <w:t xml:space="preserve"> branch:</w:t>
-      </w:r>
-    </w:p>
-    <w:p/>
-    <w:p>
-      <w:r>
-        <w:pict w14:anchorId="247A863F">
-          <v:rect id="_x0000_i1647" style="width:0;height:1.5pt" o:hralign="center" o:hrstd="t" o:hr="t" fillcolor="#a0a0a0" stroked="f"/>
-        </w:pict>
-      </w:r>
-    </w:p>
-    <w:p>
-      <w:pPr>
-        <w:rPr>
-          <w:b/>
-          <w:bCs/>
-        </w:rPr>
-      </w:pPr>
-      <w:r>
-        <w:rPr>
-          <w:b/>
-          <w:bCs/>
-        </w:rPr>
-        <w:t>DevOps Capstone Project – Trading Game</w:t>
-      </w:r>
-    </w:p>
-    <w:p>
-      <w:pPr>
-        <w:rPr>
-          <w:b/>
-          <w:bCs/>
-        </w:rPr>
-      </w:pPr>
-      <w:r>
-        <w:rPr>
-          <w:b/>
-          <w:bCs/>
-        </w:rPr>
-        <w:t>Sprint 4: CI/CD Pipeline for Application Deployment on Kubernetes (EKS)</w:t>
-      </w:r>
-    </w:p>
-    <w:p>
-      <w:r>
-        <w:pict w14:anchorId="0B7CEB3E">
-          <v:rect id="_x0000_i1648" style="width:0;height:1.5pt" o:hralign="center" o:hrstd="t" o:hr="t" fillcolor="#a0a0a0" stroked="f"/>
-        </w:pict>
-      </w:r>
-    </w:p>
-    <w:p>
-      <w:pPr>
-        <w:rPr>
-          <w:b/>
-          <w:bCs/>
-        </w:rPr>
-      </w:pPr>
-      <w:r>
-        <w:rPr>
-          <w:b/>
-          <w:bCs/>
-        </w:rPr>
-        <w:t> Objective</w:t>
-      </w:r>
-    </w:p>
-    <w:p>
-      <w:r>
-        <w:t>The objective of Sprint 4 is to implement a CI/CD pipeline using Jenkins that automates the process of building, pushing, and deploying the application to a Kubernetes cluster (Amazon EKS). The goal is to ensure seamless and automated deployment from code to production.</w:t>
-      </w:r>
-    </w:p>
-    <w:p>
-      <w:r>
-        <w:pict w14:anchorId="52596085">
-          <v:rect id="_x0000_i1649" style="width:0;height:1.5pt" o:hralign="center" o:hrstd="t" o:hr="t" fillcolor="#a0a0a0" stroked="f"/>
-        </w:pict>
-      </w:r>
-    </w:p>
-    <w:p>
-      <w:pPr>
-        <w:rPr>
-          <w:b/>
-          <w:bCs/>
-        </w:rPr>
-      </w:pPr>
-      <w:r>
-        <w:rPr>
-          <w:b/>
-          <w:bCs/>
-        </w:rPr>
-        <w:t> Architecture Overview</w:t>
-      </w:r>
-    </w:p>
-    <w:p>
-      <w:r>
-        <w:t>Developer → GitHub → Jenkins → (Build &amp; Push) → Kubernetes (EKS) → Application</w:t>
-      </w:r>
-    </w:p>
-    <w:p/>
-    <w:p>
-      <w:r>
         <w:pict w14:anchorId="49D8B498">
-          <v:rect id="_x0000_i1650" style="width:0;height:1.5pt" o:hralign="center" o:hrstd="t" o:hr="t" fillcolor="#a0a0a0" stroked="f"/>
+          <v:rect id="_x0000_i1089" style="width:0;height:1.5pt" o:hralign="center" o:hrstd="t" o:hr="t" fillcolor="#a0a0a0" stroked="f"/>
         </w:pict>
       </w:r>
     </w:p>
@@ -5960,7 +5291,7 @@
     <w:p>
       <w:r>
         <w:pict w14:anchorId="199502BD">
-          <v:rect id="_x0000_i1651" style="width:0;height:1.5pt" o:hralign="center" o:hrstd="t" o:hr="t" fillcolor="#a0a0a0" stroked="f"/>
+          <v:rect id="_x0000_i1090" style="width:0;height:1.5pt" o:hralign="center" o:hrstd="t" o:hr="t" fillcolor="#a0a0a0" stroked="f"/>
         </w:pict>
       </w:r>
     </w:p>
@@ -5987,7 +5318,6 @@
         </w:numPr>
       </w:pPr>
       <w:r>
-        <w:lastRenderedPageBreak/>
         <w:t>Jenkins – CI/CD pipeline automation</w:t>
       </w:r>
     </w:p>
@@ -6038,7 +5368,7 @@
     <w:p>
       <w:r>
         <w:pict w14:anchorId="0496C622">
-          <v:rect id="_x0000_i1652" style="width:0;height:1.5pt" o:hralign="center" o:hrstd="t" o:hr="t" fillcolor="#a0a0a0" stroked="f"/>
+          <v:rect id="_x0000_i1091" style="width:0;height:1.5pt" o:hralign="center" o:hrstd="t" o:hr="t" fillcolor="#a0a0a0" stroked="f"/>
         </w:pict>
       </w:r>
     </w:p>
@@ -6079,80 +5409,40 @@
     </w:p>
     <w:p>
       <w:r>
-        <w:t>    backend-</w:t>
-      </w:r>
-      <w:proofErr w:type="spellStart"/>
-      <w:proofErr w:type="gramStart"/>
-      <w:r>
-        <w:t>deployment.yaml</w:t>
-      </w:r>
-      <w:proofErr w:type="spellEnd"/>
-      <w:proofErr w:type="gramEnd"/>
-    </w:p>
-    <w:p>
-      <w:r>
-        <w:t>    backend-</w:t>
-      </w:r>
-      <w:proofErr w:type="spellStart"/>
-      <w:proofErr w:type="gramStart"/>
-      <w:r>
-        <w:t>service.yaml</w:t>
-      </w:r>
-      <w:proofErr w:type="spellEnd"/>
-      <w:proofErr w:type="gramEnd"/>
+        <w:t>    backend-deployment.yaml</w:t>
+      </w:r>
+    </w:p>
+    <w:p>
+      <w:r>
+        <w:t>    backend-service.yaml</w:t>
+      </w:r>
     </w:p>
     <w:p>
       <w:r>
         <w:lastRenderedPageBreak/>
-        <w:t>    frontend-</w:t>
-      </w:r>
-      <w:proofErr w:type="spellStart"/>
-      <w:proofErr w:type="gramStart"/>
-      <w:r>
-        <w:t>deployment.yaml</w:t>
-      </w:r>
-      <w:proofErr w:type="spellEnd"/>
-      <w:proofErr w:type="gramEnd"/>
-    </w:p>
-    <w:p>
-      <w:r>
-        <w:t>    frontend-</w:t>
-      </w:r>
-      <w:proofErr w:type="spellStart"/>
-      <w:proofErr w:type="gramStart"/>
-      <w:r>
-        <w:t>service.yaml</w:t>
-      </w:r>
-      <w:proofErr w:type="spellEnd"/>
-      <w:proofErr w:type="gramEnd"/>
-    </w:p>
-    <w:p>
-      <w:r>
-        <w:t>    </w:t>
-      </w:r>
-      <w:proofErr w:type="spellStart"/>
-      <w:proofErr w:type="gramStart"/>
-      <w:r>
-        <w:t>hpa.yaml</w:t>
-      </w:r>
-      <w:proofErr w:type="spellEnd"/>
-      <w:proofErr w:type="gramEnd"/>
-    </w:p>
-    <w:p>
-      <w:r>
-        <w:t>  </w:t>
-      </w:r>
-      <w:proofErr w:type="spellStart"/>
-      <w:r>
-        <w:t>Jenkinsfile</w:t>
-      </w:r>
-      <w:proofErr w:type="spellEnd"/>
+        <w:t>    frontend-deployment.yaml</w:t>
+      </w:r>
+    </w:p>
+    <w:p>
+      <w:r>
+        <w:t>    frontend-service.yaml</w:t>
+      </w:r>
+    </w:p>
+    <w:p>
+      <w:r>
+        <w:t>    hpa.yaml</w:t>
+      </w:r>
+    </w:p>
+    <w:p>
+      <w:r>
+        <w:t>  Jenkinsfile</w:t>
+      </w:r>
     </w:p>
     <w:p/>
     <w:p>
       <w:r>
         <w:pict w14:anchorId="273BC60B">
-          <v:rect id="_x0000_i1653" style="width:0;height:1.5pt" o:hralign="center" o:hrstd="t" o:hr="t" fillcolor="#a0a0a0" stroked="f"/>
+          <v:rect id="_x0000_i1092" style="width:0;height:1.5pt" o:hralign="center" o:hrstd="t" o:hr="t" fillcolor="#a0a0a0" stroked="f"/>
         </w:pict>
       </w:r>
     </w:p>
@@ -6174,7 +5464,7 @@
     <w:p>
       <w:r>
         <w:pict w14:anchorId="3B29569C">
-          <v:rect id="_x0000_i1654" style="width:0;height:1.5pt" o:hralign="center" o:hrstd="t" o:hr="t" fillcolor="#a0a0a0" stroked="f"/>
+          <v:rect id="_x0000_i1093" style="width:0;height:1.5pt" o:hralign="center" o:hrstd="t" o:hr="t" fillcolor="#a0a0a0" stroked="f"/>
         </w:pict>
       </w:r>
     </w:p>
@@ -6234,29 +5524,13 @@
         </w:numPr>
       </w:pPr>
       <w:r>
-        <w:t>Services (</w:t>
-      </w:r>
-      <w:proofErr w:type="spellStart"/>
-      <w:r>
-        <w:t>ClusterIP</w:t>
-      </w:r>
-      <w:proofErr w:type="spellEnd"/>
-      <w:r>
-        <w:t xml:space="preserve"> &amp; </w:t>
-      </w:r>
-      <w:proofErr w:type="spellStart"/>
-      <w:r>
-        <w:t>LoadBalancer</w:t>
-      </w:r>
-      <w:proofErr w:type="spellEnd"/>
-      <w:r>
-        <w:t>)</w:t>
+        <w:t>Services (ClusterIP &amp; LoadBalancer)</w:t>
       </w:r>
     </w:p>
     <w:p>
       <w:r>
         <w:pict w14:anchorId="3BEC6481">
-          <v:rect id="_x0000_i1655" style="width:0;height:1.5pt" o:hralign="center" o:hrstd="t" o:hr="t" fillcolor="#a0a0a0" stroked="f"/>
+          <v:rect id="_x0000_i1094" style="width:0;height:1.5pt" o:hralign="center" o:hrstd="t" o:hr="t" fillcolor="#a0a0a0" stroked="f"/>
         </w:pict>
       </w:r>
     </w:p>
@@ -6305,7 +5579,7 @@
     <w:p>
       <w:r>
         <w:pict w14:anchorId="76D88DCA">
-          <v:rect id="_x0000_i1656" style="width:0;height:1.5pt" o:hralign="center" o:hrstd="t" o:hr="t" fillcolor="#a0a0a0" stroked="f"/>
+          <v:rect id="_x0000_i1095" style="width:0;height:1.5pt" o:hralign="center" o:hrstd="t" o:hr="t" fillcolor="#a0a0a0" stroked="f"/>
         </w:pict>
       </w:r>
     </w:p>
@@ -6321,23 +5595,7 @@
           <w:b/>
           <w:bCs/>
         </w:rPr>
-        <w:t xml:space="preserve"> 3. Horizontal Pod </w:t>
-      </w:r>
-      <w:proofErr w:type="spellStart"/>
-      <w:r>
-        <w:rPr>
-          <w:b/>
-          <w:bCs/>
-        </w:rPr>
-        <w:t>Autoscaler</w:t>
-      </w:r>
-      <w:proofErr w:type="spellEnd"/>
-      <w:r>
-        <w:rPr>
-          <w:b/>
-          <w:bCs/>
-        </w:rPr>
-        <w:t xml:space="preserve"> (HPA)</w:t>
+        <w:t> 3. Horizontal Pod Autoscaler (HPA)</w:t>
       </w:r>
     </w:p>
     <w:p>
@@ -6381,7 +5639,7 @@
     <w:p>
       <w:r>
         <w:pict w14:anchorId="6CC471EB">
-          <v:rect id="_x0000_i1657" style="width:0;height:1.5pt" o:hralign="center" o:hrstd="t" o:hr="t" fillcolor="#a0a0a0" stroked="f"/>
+          <v:rect id="_x0000_i1096" style="width:0;height:1.5pt" o:hralign="center" o:hrstd="t" o:hr="t" fillcolor="#a0a0a0" stroked="f"/>
         </w:pict>
       </w:r>
     </w:p>
@@ -6430,7 +5688,7 @@
     <w:p>
       <w:r>
         <w:pict w14:anchorId="4753482B">
-          <v:rect id="_x0000_i1658" style="width:0;height:1.5pt" o:hralign="center" o:hrstd="t" o:hr="t" fillcolor="#a0a0a0" stroked="f"/>
+          <v:rect id="_x0000_i1097" style="width:0;height:1.5pt" o:hralign="center" o:hrstd="t" o:hr="t" fillcolor="#a0a0a0" stroked="f"/>
         </w:pict>
       </w:r>
     </w:p>
@@ -6446,23 +5704,7 @@
           <w:b/>
           <w:bCs/>
         </w:rPr>
-        <w:t> </w:t>
-      </w:r>
-      <w:proofErr w:type="spellStart"/>
-      <w:r>
-        <w:rPr>
-          <w:b/>
-          <w:bCs/>
-        </w:rPr>
-        <w:t>Jenkinsfile</w:t>
-      </w:r>
-      <w:proofErr w:type="spellEnd"/>
-      <w:r>
-        <w:rPr>
-          <w:b/>
-          <w:bCs/>
-        </w:rPr>
-        <w:t xml:space="preserve"> (Pipeline)</w:t>
+        <w:t> Jenkinsfile (Pipeline)</w:t>
       </w:r>
     </w:p>
     <w:p>
@@ -6484,15 +5726,7 @@
     <w:p/>
     <w:p>
       <w:r>
-        <w:t>        </w:t>
-      </w:r>
-      <w:proofErr w:type="gramStart"/>
-      <w:r>
-        <w:t>stage(</w:t>
-      </w:r>
-      <w:proofErr w:type="gramEnd"/>
-      <w:r>
-        <w:t>'Clone Repo') {</w:t>
+        <w:t>        stage('Clone Repo') {</w:t>
       </w:r>
     </w:p>
     <w:p>
@@ -6502,15 +5736,7 @@
     </w:p>
     <w:p>
       <w:r>
-        <w:t>                git branch: 'sprint4', url: 'https://github.com/Priyanka-1920/Capstone-</w:t>
-      </w:r>
-      <w:proofErr w:type="spellStart"/>
-      <w:r>
-        <w:t>TradingGame.git</w:t>
-      </w:r>
-      <w:proofErr w:type="spellEnd"/>
-      <w:r>
-        <w:t>'</w:t>
+        <w:t>                git branch: 'sprint4', url: 'https://github.com/Priyanka-1920/Capstone-TradingGame.git'</w:t>
       </w:r>
     </w:p>
     <w:p>
@@ -6589,15 +5815,7 @@
     </w:p>
     <w:p>
       <w:r>
-        <w:t>                echo '</w:t>
-      </w:r>
-      <w:proofErr w:type="spellStart"/>
-      <w:r>
-        <w:t>kubectl</w:t>
-      </w:r>
-      <w:proofErr w:type="spellEnd"/>
-      <w:r>
-        <w:t xml:space="preserve"> apply -f k8s/ (simulated)'</w:t>
+        <w:t>                echo 'kubectl apply -f k8s/ (simulated)'</w:t>
       </w:r>
     </w:p>
     <w:p>
@@ -6651,7 +5869,7 @@
     <w:p>
       <w:r>
         <w:pict w14:anchorId="610486F1">
-          <v:rect id="_x0000_i1659" style="width:0;height:1.5pt" o:hralign="center" o:hrstd="t" o:hr="t" fillcolor="#a0a0a0" stroked="f"/>
+          <v:rect id="_x0000_i1098" style="width:0;height:1.5pt" o:hralign="center" o:hrstd="t" o:hr="t" fillcolor="#a0a0a0" stroked="f"/>
         </w:pict>
       </w:r>
     </w:p>
@@ -6676,35 +5894,20 @@
       </w:r>
     </w:p>
     <w:p>
-      <w:proofErr w:type="spellStart"/>
-      <w:r>
-        <w:t>kubectl</w:t>
-      </w:r>
-      <w:proofErr w:type="spellEnd"/>
-      <w:r>
-        <w:t xml:space="preserve"> apply -f k8s/</w:t>
-      </w:r>
-    </w:p>
-    <w:p>
-      <w:proofErr w:type="spellStart"/>
-      <w:r>
-        <w:t>kubectl</w:t>
-      </w:r>
-      <w:proofErr w:type="spellEnd"/>
-      <w:r>
-        <w:t xml:space="preserve"> apply -f k8s/</w:t>
-      </w:r>
-      <w:proofErr w:type="spellStart"/>
-      <w:r>
-        <w:t>hpa.yaml</w:t>
-      </w:r>
-      <w:proofErr w:type="spellEnd"/>
+      <w:r>
+        <w:t>kubectl apply -f k8s/</w:t>
+      </w:r>
+    </w:p>
+    <w:p>
+      <w:r>
+        <w:t>kubectl apply -f k8s/hpa.yaml</w:t>
+      </w:r>
     </w:p>
     <w:p/>
     <w:p>
       <w:r>
         <w:pict w14:anchorId="05B9A5EB">
-          <v:rect id="_x0000_i1660" style="width:0;height:1.5pt" o:hralign="center" o:hrstd="t" o:hr="t" fillcolor="#a0a0a0" stroked="f"/>
+          <v:rect id="_x0000_i1099" style="width:0;height:1.5pt" o:hralign="center" o:hrstd="t" o:hr="t" fillcolor="#a0a0a0" stroked="f"/>
         </w:pict>
       </w:r>
     </w:p>
@@ -6724,45 +5927,25 @@
       </w:r>
     </w:p>
     <w:p>
-      <w:proofErr w:type="spellStart"/>
-      <w:r>
-        <w:t>kubectl</w:t>
-      </w:r>
-      <w:proofErr w:type="spellEnd"/>
-      <w:r>
-        <w:t xml:space="preserve"> get pods</w:t>
-      </w:r>
-    </w:p>
-    <w:p>
-      <w:proofErr w:type="spellStart"/>
-      <w:r>
-        <w:t>kubectl</w:t>
-      </w:r>
-      <w:proofErr w:type="spellEnd"/>
-      <w:r>
-        <w:t xml:space="preserve"> get svc</w:t>
-      </w:r>
-    </w:p>
-    <w:p>
-      <w:proofErr w:type="spellStart"/>
-      <w:r>
-        <w:t>kubectl</w:t>
-      </w:r>
-      <w:proofErr w:type="spellEnd"/>
-      <w:r>
-        <w:t xml:space="preserve"> get </w:t>
-      </w:r>
-      <w:proofErr w:type="spellStart"/>
-      <w:r>
-        <w:t>hpa</w:t>
-      </w:r>
-      <w:proofErr w:type="spellEnd"/>
+      <w:r>
+        <w:t>kubectl get pods</w:t>
+      </w:r>
+    </w:p>
+    <w:p>
+      <w:r>
+        <w:t>kubectl get svc</w:t>
+      </w:r>
+    </w:p>
+    <w:p>
+      <w:r>
+        <w:t>kubectl get hpa</w:t>
+      </w:r>
     </w:p>
     <w:p/>
     <w:p>
       <w:r>
         <w:pict w14:anchorId="3E1EDE18">
-          <v:rect id="_x0000_i1661" style="width:0;height:1.5pt" o:hralign="center" o:hrstd="t" o:hr="t" fillcolor="#a0a0a0" stroked="f"/>
+          <v:rect id="_x0000_i1100" style="width:0;height:1.5pt" o:hralign="center" o:hrstd="t" o:hr="t" fillcolor="#a0a0a0" stroked="f"/>
         </w:pict>
       </w:r>
     </w:p>
@@ -6784,7 +5967,7 @@
     <w:p>
       <w:r>
         <w:pict w14:anchorId="413B21A0">
-          <v:rect id="_x0000_i1662" style="width:0;height:1.5pt" o:hralign="center" o:hrstd="t" o:hr="t" fillcolor="#a0a0a0" stroked="f"/>
+          <v:rect id="_x0000_i1101" style="width:0;height:1.5pt" o:hralign="center" o:hrstd="t" o:hr="t" fillcolor="#a0a0a0" stroked="f"/>
         </w:pict>
       </w:r>
     </w:p>
@@ -6831,7 +6014,7 @@
     <w:p>
       <w:r>
         <w:pict w14:anchorId="1485C7FA">
-          <v:rect id="_x0000_i1663" style="width:0;height:1.5pt" o:hralign="center" o:hrstd="t" o:hr="t" fillcolor="#a0a0a0" stroked="f"/>
+          <v:rect id="_x0000_i1102" style="width:0;height:1.5pt" o:hralign="center" o:hrstd="t" o:hr="t" fillcolor="#a0a0a0" stroked="f"/>
         </w:pict>
       </w:r>
     </w:p>
@@ -6878,7 +6061,7 @@
     <w:p>
       <w:r>
         <w:pict w14:anchorId="6B5574EB">
-          <v:rect id="_x0000_i1664" style="width:0;height:1.5pt" o:hralign="center" o:hrstd="t" o:hr="t" fillcolor="#a0a0a0" stroked="f"/>
+          <v:rect id="_x0000_i1103" style="width:0;height:1.5pt" o:hralign="center" o:hrstd="t" o:hr="t" fillcolor="#a0a0a0" stroked="f"/>
         </w:pict>
       </w:r>
     </w:p>
@@ -6919,36 +6102,13 @@
         <w:t>Solution:</w:t>
       </w:r>
       <w:r>
-        <w:t xml:space="preserve"> </w:t>
-      </w:r>
-      <w:proofErr w:type="gramStart"/>
-      <w:r>
-        <w:t>Added .</w:t>
-      </w:r>
-      <w:proofErr w:type="spellStart"/>
-      <w:r>
-        <w:t>gitignore</w:t>
-      </w:r>
-      <w:proofErr w:type="spellEnd"/>
-      <w:proofErr w:type="gramEnd"/>
-      <w:r>
-        <w:t xml:space="preserve"> and </w:t>
-      </w:r>
-      <w:proofErr w:type="gramStart"/>
-      <w:r>
-        <w:t>removed .</w:t>
-      </w:r>
-      <w:proofErr w:type="spellStart"/>
-      <w:r>
-        <w:t>tfstate</w:t>
-      </w:r>
-      <w:proofErr w:type="spellEnd"/>
-      <w:proofErr w:type="gramEnd"/>
+        <w:t xml:space="preserve"> Added .gitignore and removed .tfstate</w:t>
+      </w:r>
     </w:p>
     <w:p>
       <w:r>
         <w:pict w14:anchorId="487356ED">
-          <v:rect id="_x0000_i1665" style="width:0;height:1.5pt" o:hralign="center" o:hrstd="t" o:hr="t" fillcolor="#a0a0a0" stroked="f"/>
+          <v:rect id="_x0000_i1104" style="width:0;height:1.5pt" o:hralign="center" o:hrstd="t" o:hr="t" fillcolor="#a0a0a0" stroked="f"/>
         </w:pict>
       </w:r>
     </w:p>
@@ -7029,7 +6189,7 @@
     <w:p>
       <w:r>
         <w:pict w14:anchorId="0BDAB02C">
-          <v:rect id="_x0000_i1666" style="width:0;height:1.5pt" o:hralign="center" o:hrstd="t" o:hr="t" fillcolor="#a0a0a0" stroked="f"/>
+          <v:rect id="_x0000_i1105" style="width:0;height:1.5pt" o:hralign="center" o:hrstd="t" o:hr="t" fillcolor="#a0a0a0" stroked="f"/>
         </w:pict>
       </w:r>
     </w:p>
@@ -7106,7 +6266,7 @@
     <w:p>
       <w:r>
         <w:pict w14:anchorId="5FA534F1">
-          <v:rect id="_x0000_i1667" style="width:0;height:1.5pt" o:hralign="center" o:hrstd="t" o:hr="t" fillcolor="#a0a0a0" stroked="f"/>
+          <v:rect id="_x0000_i1106" style="width:0;height:1.5pt" o:hralign="center" o:hrstd="t" o:hr="t" fillcolor="#a0a0a0" stroked="f"/>
         </w:pict>
       </w:r>
     </w:p>
@@ -7134,14 +6294,14 @@
     <w:p>
       <w:r>
         <w:pict w14:anchorId="5FECDACA">
-          <v:rect id="_x0000_i1668" style="width:0;height:1.5pt" o:hralign="center" o:hrstd="t" o:hr="t" fillcolor="#a0a0a0" stroked="f"/>
+          <v:rect id="_x0000_i1107" style="width:0;height:1.5pt" o:hralign="center" o:hrstd="t" o:hr="t" fillcolor="#a0a0a0" stroked="f"/>
         </w:pict>
       </w:r>
     </w:p>
     <w:p>
       <w:r>
         <w:pict w14:anchorId="1C925E09">
-          <v:rect id="_x0000_i1669" style="width:0;height:1.5pt" o:hralign="center" o:hrstd="t" o:hr="t" fillcolor="#a0a0a0" stroked="f"/>
+          <v:rect id="_x0000_i1108" style="width:0;height:1.5pt" o:hralign="center" o:hrstd="t" o:hr="t" fillcolor="#a0a0a0" stroked="f"/>
         </w:pict>
       </w:r>
     </w:p>
@@ -7170,57 +6330,23 @@
     </w:p>
     <w:p/>
     <w:p>
-      <w:proofErr w:type="spellStart"/>
-      <w:r>
-        <w:rPr>
-          <w:b/>
-          <w:bCs/>
-        </w:rPr>
-        <w:t>kubectl</w:t>
-      </w:r>
-      <w:proofErr w:type="spellEnd"/>
-      <w:r>
-        <w:rPr>
-          <w:b/>
-          <w:bCs/>
-        </w:rPr>
-        <w:t xml:space="preserve"> get svc</w:t>
+      <w:r>
+        <w:rPr>
+          <w:b/>
+          <w:bCs/>
+        </w:rPr>
+        <w:t>kubectl get svc</w:t>
       </w:r>
     </w:p>
     <w:p/>
     <w:p/>
     <w:p>
-      <w:proofErr w:type="spellStart"/>
-      <w:r>
-        <w:rPr>
-          <w:b/>
-          <w:bCs/>
-        </w:rPr>
-        <w:t>Kubectl</w:t>
-      </w:r>
-      <w:proofErr w:type="spellEnd"/>
-      <w:r>
-        <w:rPr>
-          <w:b/>
-          <w:bCs/>
-        </w:rPr>
-        <w:t xml:space="preserve"> </w:t>
-      </w:r>
-      <w:proofErr w:type="spellStart"/>
-      <w:r>
-        <w:rPr>
-          <w:b/>
-          <w:bCs/>
-        </w:rPr>
-        <w:t>hpa</w:t>
-      </w:r>
-      <w:proofErr w:type="spellEnd"/>
-      <w:r>
-        <w:rPr>
-          <w:b/>
-          <w:bCs/>
-        </w:rPr>
-        <w:t xml:space="preserve"> running</w:t>
+      <w:r>
+        <w:rPr>
+          <w:b/>
+          <w:bCs/>
+        </w:rPr>
+        <w:t>Kubectl hpa running</w:t>
       </w:r>
     </w:p>
     <w:p/>
@@ -13887,6 +13013,7 @@
   <w:style w:type="character" w:default="1" w:styleId="DefaultParagraphFont">
     <w:name w:val="Default Paragraph Font"/>
     <w:uiPriority w:val="1"/>
+    <w:semiHidden/>
     <w:unhideWhenUsed/>
   </w:style>
   <w:style w:type="table" w:default="1" w:styleId="TableNormal">

</xml_diff>